<commit_message>
Updated duplicate id pipeline
</commit_message>
<xml_diff>
--- a/HGT_pipeline.docx
+++ b/HGT_pipeline.docx
@@ -29,16 +29,6 @@
         <w:rPr>
           <w:b/>
           <w:bCs/>
-          <w:i/>
-          <w:iCs/>
-        </w:rPr>
-      </w:pPr>
-    </w:p>
-    <w:p>
-      <w:pPr>
-        <w:rPr>
-          <w:b/>
-          <w:bCs/>
           <w:iCs/>
         </w:rPr>
       </w:pPr>
@@ -148,93 +138,6 @@
           <w:iCs/>
         </w:rPr>
         <w:t>1.1.chopping_genome.sh</w:t>
-      </w:r>
-    </w:p>
-    <w:p>
-      <w:pPr>
-        <w:rPr>
-          <w:i/>
-          <w:iCs/>
-        </w:rPr>
-      </w:pPr>
-    </w:p>
-    <w:p>
-      <w:pPr>
-        <w:rPr>
-          <w:color w:val="FF0000"/>
-        </w:rPr>
-      </w:pPr>
-      <w:r>
-        <w:rPr>
-          <w:color w:val="FF0000"/>
-        </w:rPr>
-        <w:t xml:space="preserve">Confirming that we should use all ~70 </w:t>
-      </w:r>
-      <w:proofErr w:type="spellStart"/>
-      <w:r>
-        <w:rPr>
-          <w:color w:val="FF0000"/>
-        </w:rPr>
-        <w:t>Blattabacterium</w:t>
-      </w:r>
-      <w:proofErr w:type="spellEnd"/>
-      <w:r>
-        <w:rPr>
-          <w:color w:val="FF0000"/>
-        </w:rPr>
-        <w:t xml:space="preserve"> genomes published in </w:t>
-      </w:r>
-      <w:r>
-        <w:rPr>
-          <w:color w:val="FF0000"/>
-        </w:rPr>
-        <w:t>Beasley-Hall et al. (2021)</w:t>
-      </w:r>
-      <w:r>
-        <w:rPr>
-          <w:color w:val="FF0000"/>
-        </w:rPr>
-        <w:t xml:space="preserve"> and </w:t>
-      </w:r>
-      <w:proofErr w:type="spellStart"/>
-      <w:r>
-        <w:rPr>
-          <w:color w:val="FF0000"/>
-        </w:rPr>
-        <w:t>Bourguingnon</w:t>
-      </w:r>
-      <w:proofErr w:type="spellEnd"/>
-      <w:r>
-        <w:rPr>
-          <w:color w:val="FF0000"/>
-        </w:rPr>
-        <w:t xml:space="preserve"> et al. (2020)?</w:t>
-      </w:r>
-    </w:p>
-    <w:p>
-      <w:pPr>
-        <w:rPr>
-          <w:color w:val="FF0000"/>
-        </w:rPr>
-      </w:pPr>
-    </w:p>
-    <w:p>
-      <w:pPr>
-        <w:rPr>
-          <w:color w:val="4C94D8" w:themeColor="text2" w:themeTint="80"/>
-        </w:rPr>
-      </w:pPr>
-      <w:r>
-        <w:rPr>
-          <w:color w:val="4C94D8" w:themeColor="text2" w:themeTint="80"/>
-        </w:rPr>
-        <w:sym w:font="Wingdings" w:char="F0E0"/>
-      </w:r>
-      <w:r>
-        <w:rPr>
-          <w:color w:val="4C94D8" w:themeColor="text2" w:themeTint="80"/>
-        </w:rPr>
-        <w:t xml:space="preserve"> Yes, this looks to be the most comprehensive approach. </w:t>
       </w:r>
     </w:p>
     <w:p/>
@@ -1353,7 +1256,6 @@
         </w:numPr>
       </w:pPr>
       <w:r>
-        <w:lastRenderedPageBreak/>
         <w:t xml:space="preserve">from CNSA </w:t>
       </w:r>
       <w:r>
@@ -1516,6 +1418,7 @@
           <w:i/>
           <w:iCs/>
         </w:rPr>
+        <w:lastRenderedPageBreak/>
         <w:t xml:space="preserve">Blattella germanica </w:t>
       </w:r>
       <w:r>
@@ -1888,93 +1791,6 @@
         <w:t>No annotation available.</w:t>
       </w:r>
     </w:p>
-    <w:p/>
-    <w:p>
-      <w:pPr>
-        <w:rPr>
-          <w:color w:val="FF0000"/>
-        </w:rPr>
-      </w:pPr>
-      <w:r>
-        <w:rPr>
-          <w:color w:val="FF0000"/>
-        </w:rPr>
-        <w:t>Confirming that we should use all of these genomes, even though sampling is quite bias</w:t>
-      </w:r>
-      <w:r>
-        <w:rPr>
-          <w:color w:val="FF0000"/>
-        </w:rPr>
-        <w:t>ed</w:t>
-      </w:r>
-      <w:r>
-        <w:rPr>
-          <w:color w:val="FF0000"/>
-        </w:rPr>
-        <w:t>?</w:t>
-      </w:r>
-      <w:r>
-        <w:rPr>
-          <w:color w:val="FF0000"/>
-        </w:rPr>
-        <w:t xml:space="preserve"> Are we also using the new termite genomes from your colleagues?</w:t>
-      </w:r>
-    </w:p>
-    <w:p>
-      <w:pPr>
-        <w:rPr>
-          <w:b/>
-          <w:bCs/>
-          <w:iCs/>
-        </w:rPr>
-      </w:pPr>
-    </w:p>
-    <w:p>
-      <w:pPr>
-        <w:rPr>
-          <w:color w:val="4C94D8" w:themeColor="text2" w:themeTint="80"/>
-        </w:rPr>
-      </w:pPr>
-      <w:r>
-        <w:rPr>
-          <w:color w:val="4C94D8" w:themeColor="text2" w:themeTint="80"/>
-        </w:rPr>
-        <w:sym w:font="Wingdings" w:char="F0E0"/>
-      </w:r>
-      <w:r>
-        <w:rPr>
-          <w:color w:val="4C94D8" w:themeColor="text2" w:themeTint="80"/>
-        </w:rPr>
-        <w:t xml:space="preserve"> </w:t>
-      </w:r>
-      <w:r>
-        <w:rPr>
-          <w:color w:val="4C94D8" w:themeColor="text2" w:themeTint="80"/>
-        </w:rPr>
-        <w:t>Yes, might as well use whatever is available</w:t>
-      </w:r>
-      <w:r>
-        <w:rPr>
-          <w:color w:val="4C94D8" w:themeColor="text2" w:themeTint="80"/>
-        </w:rPr>
-        <w:t>.</w:t>
-      </w:r>
-      <w:r>
-        <w:rPr>
-          <w:color w:val="4C94D8" w:themeColor="text2" w:themeTint="80"/>
-        </w:rPr>
-        <w:t xml:space="preserve"> I’ve just written to Kiyoto Maekawa about the new termite genomes. </w:t>
-      </w:r>
-    </w:p>
-    <w:p>
-      <w:pPr>
-        <w:rPr>
-          <w:b/>
-          <w:bCs/>
-          <w:iCs/>
-        </w:rPr>
-      </w:pPr>
-    </w:p>
     <w:p>
       <w:pPr>
         <w:rPr>
@@ -2160,71 +1976,35 @@
     <w:p>
       <w:pPr>
         <w:rPr>
-          <w:color w:val="FF0000"/>
-        </w:rPr>
-      </w:pPr>
-      <w:r>
-        <w:rPr>
-          <w:color w:val="FF0000"/>
-        </w:rPr>
-        <w:t>Do the</w:t>
-      </w:r>
-      <w:r>
-        <w:rPr>
-          <w:color w:val="FF0000"/>
-        </w:rPr>
-        <w:t xml:space="preserve"> thresholds above (‘200’ and ‘75’) seem reasonable to you</w:t>
-      </w:r>
-      <w:r>
-        <w:rPr>
-          <w:color w:val="FF0000"/>
-        </w:rPr>
-        <w:t>?</w:t>
-      </w:r>
-    </w:p>
-    <w:p>
-      <w:pPr>
-        <w:rPr>
-          <w:color w:val="FF0000"/>
-        </w:rPr>
-      </w:pPr>
-    </w:p>
-    <w:p>
-      <w:pPr>
-        <w:rPr>
-          <w:color w:val="FF0000"/>
-        </w:rPr>
-      </w:pPr>
-      <w:r>
-        <w:rPr>
-          <w:color w:val="4C94D8" w:themeColor="text2" w:themeTint="80"/>
-        </w:rPr>
-        <w:sym w:font="Wingdings" w:char="F0E0"/>
-      </w:r>
-      <w:r>
-        <w:rPr>
-          <w:color w:val="4C94D8" w:themeColor="text2" w:themeTint="80"/>
-        </w:rPr>
-        <w:t xml:space="preserve"> </w:t>
-      </w:r>
-      <w:r>
-        <w:rPr>
-          <w:color w:val="4C94D8" w:themeColor="text2" w:themeTint="80"/>
-        </w:rPr>
-        <w:t xml:space="preserve">200 for the elongation sounds good. The lower number is a bit harder to decide upon. 75 seems reasonable, although I guess we could go as low as maybe 50, given </w:t>
-      </w:r>
-      <w:r>
-        <w:rPr>
-          <w:color w:val="4C94D8" w:themeColor="text2" w:themeTint="80"/>
-        </w:rPr>
-        <w:t xml:space="preserve">that the chances of two sequences being highly similar at 50 bp are extremely low. </w:t>
-      </w:r>
-    </w:p>
-    <w:p>
-      <w:pPr>
-        <w:rPr>
-          <w:b/>
-          <w:bCs/>
+          <w:b/>
+          <w:bCs/>
+          <w:color w:val="000000" w:themeColor="text1"/>
+        </w:rPr>
+      </w:pPr>
+      <w:r>
+        <w:rPr>
+          <w:b/>
+          <w:bCs/>
+          <w:color w:val="000000" w:themeColor="text1"/>
+          <w:highlight w:val="yellow"/>
+        </w:rPr>
+        <w:t xml:space="preserve">Go down to 50 </w:t>
+      </w:r>
+      <w:proofErr w:type="gramStart"/>
+      <w:r>
+        <w:rPr>
+          <w:b/>
+          <w:bCs/>
+          <w:color w:val="000000" w:themeColor="text1"/>
+          <w:highlight w:val="yellow"/>
+        </w:rPr>
+        <w:t>bp</w:t>
+      </w:r>
+      <w:proofErr w:type="gramEnd"/>
+    </w:p>
+    <w:p>
+      <w:pPr>
+        <w:rPr>
           <w:i/>
           <w:iCs/>
         </w:rPr>
@@ -2255,7 +2035,16 @@
           <w:i/>
           <w:iCs/>
         </w:rPr>
-        <w:t>2.2</w:t>
+        <w:t>2.</w:t>
+      </w:r>
+      <w:r>
+        <w:rPr>
+          <w:b/>
+          <w:bCs/>
+          <w:i/>
+          <w:iCs/>
+        </w:rPr>
+        <w:t>2</w:t>
       </w:r>
       <w:r>
         <w:rPr>
@@ -2269,241 +2058,49 @@
     </w:p>
     <w:p>
       <w:r>
-        <w:t>The genome annotation (when available) was used to annotate the chunks as intergenic or within a gene (and what feature of the gene).</w:t>
+        <w:t xml:space="preserve">Filtering </w:t>
+      </w:r>
+      <w:r>
+        <w:t xml:space="preserve">potential contaminant </w:t>
+      </w:r>
+      <w:proofErr w:type="spellStart"/>
+      <w:r>
+        <w:t>Blattabacterium</w:t>
+      </w:r>
+      <w:proofErr w:type="spellEnd"/>
+      <w:r>
+        <w:t xml:space="preserve"> contigs that appear as inserts. This is done by comparing the length of the HGT insert and the contig which it sits on. We can remove the insert (and contig) if the insert covers a large proportion (e.g. &gt;40%) of the contig. </w:t>
       </w:r>
     </w:p>
     <w:p/>
-    <w:p>
-      <w:r>
-        <w:t>I did this with the following script I made:</w:t>
-      </w:r>
-    </w:p>
-    <w:p>
-      <w:pPr>
-        <w:rPr>
-          <w:i/>
-          <w:iCs/>
-        </w:rPr>
-      </w:pPr>
-      <w:r>
-        <w:rPr>
-          <w:i/>
-          <w:iCs/>
-        </w:rPr>
-        <w:lastRenderedPageBreak/>
-        <w:t>2.2.annotating-bed.sh</w:t>
-      </w:r>
-    </w:p>
-    <w:p>
-      <w:pPr>
-        <w:rPr>
-          <w:i/>
-          <w:iCs/>
-        </w:rPr>
-      </w:pPr>
-    </w:p>
-    <w:p>
-      <w:pPr>
-        <w:rPr>
-          <w:b/>
-          <w:bCs/>
-          <w:i/>
-          <w:iCs/>
-        </w:rPr>
-      </w:pPr>
-      <w:r>
-        <w:rPr>
-          <w:b/>
-          <w:bCs/>
-          <w:i/>
-          <w:iCs/>
-        </w:rPr>
-        <w:t xml:space="preserve">Step </w:t>
-      </w:r>
-      <w:r>
-        <w:rPr>
-          <w:b/>
-          <w:bCs/>
-          <w:i/>
-          <w:iCs/>
-        </w:rPr>
-        <w:t>2.3</w:t>
-      </w:r>
-      <w:r>
-        <w:rPr>
-          <w:b/>
-          <w:bCs/>
-          <w:i/>
-          <w:iCs/>
+    <w:p/>
+    <w:p>
+      <w:pPr>
+        <w:rPr>
+          <w:b/>
+          <w:i/>
+        </w:rPr>
+      </w:pPr>
+      <w:r>
+        <w:rPr>
+          <w:b/>
+          <w:i/>
+        </w:rPr>
+        <w:t>Step 2.</w:t>
+      </w:r>
+      <w:r>
+        <w:rPr>
+          <w:b/>
+          <w:i/>
+        </w:rPr>
+        <w:t>3</w:t>
+      </w:r>
+      <w:r>
+        <w:rPr>
+          <w:b/>
+          <w:i/>
         </w:rPr>
         <w:t>.</w:t>
-      </w:r>
-    </w:p>
-    <w:p>
-      <w:r>
-        <w:t xml:space="preserve">Filtering </w:t>
-      </w:r>
-      <w:r>
-        <w:t xml:space="preserve">potential contaminant </w:t>
-      </w:r>
-      <w:proofErr w:type="spellStart"/>
-      <w:r>
-        <w:t>Blattabacterium</w:t>
-      </w:r>
-      <w:proofErr w:type="spellEnd"/>
-      <w:r>
-        <w:t xml:space="preserve"> contigs that appear as inserts. This is done by comparing the length of the HGT insert and the contig which it sits on. We can remove the insert (and contig) if the insert covers a large proportion (e.g. &gt;40%) of the contig. </w:t>
-      </w:r>
-    </w:p>
-    <w:p/>
-    <w:p>
-      <w:pPr>
-        <w:rPr>
-          <w:color w:val="FF0000"/>
-        </w:rPr>
-      </w:pPr>
-      <w:proofErr w:type="spellStart"/>
-      <w:r>
-        <w:rPr>
-          <w:color w:val="FF0000"/>
-        </w:rPr>
-        <w:t>Jil</w:t>
-      </w:r>
-      <w:proofErr w:type="spellEnd"/>
-      <w:r>
-        <w:rPr>
-          <w:color w:val="FF0000"/>
-        </w:rPr>
-        <w:t xml:space="preserve"> and Oscar are working on this. </w:t>
-      </w:r>
-      <w:proofErr w:type="spellStart"/>
-      <w:r>
-        <w:rPr>
-          <w:color w:val="FF0000"/>
-        </w:rPr>
-        <w:t>Jil</w:t>
-      </w:r>
-      <w:proofErr w:type="spellEnd"/>
-      <w:r>
-        <w:rPr>
-          <w:color w:val="FF0000"/>
-        </w:rPr>
-        <w:t xml:space="preserve"> has </w:t>
-      </w:r>
-      <w:r>
-        <w:rPr>
-          <w:color w:val="FF0000"/>
-        </w:rPr>
-        <w:t xml:space="preserve">already </w:t>
-      </w:r>
-      <w:r>
-        <w:rPr>
-          <w:color w:val="FF0000"/>
-        </w:rPr>
-        <w:t xml:space="preserve">made a pipeline and </w:t>
-      </w:r>
-      <w:r>
-        <w:rPr>
-          <w:color w:val="FF0000"/>
-        </w:rPr>
-        <w:t>t</w:t>
-      </w:r>
-      <w:r>
-        <w:rPr>
-          <w:color w:val="FF0000"/>
-        </w:rPr>
-        <w:t>ested</w:t>
-      </w:r>
-      <w:r>
-        <w:rPr>
-          <w:color w:val="FF0000"/>
-        </w:rPr>
-        <w:t xml:space="preserve"> it on one genome</w:t>
-      </w:r>
-      <w:r>
-        <w:rPr>
-          <w:color w:val="FF0000"/>
-        </w:rPr>
-        <w:t xml:space="preserve"> – only </w:t>
-      </w:r>
-      <w:r>
-        <w:rPr>
-          <w:color w:val="FF0000"/>
-        </w:rPr>
-        <w:t>2 inserts (of &gt;1000) were removed</w:t>
-      </w:r>
-      <w:r>
-        <w:rPr>
-          <w:color w:val="FF0000"/>
-        </w:rPr>
-        <w:t>, and it was quite obvious that these were contaminants</w:t>
-      </w:r>
-      <w:r>
-        <w:rPr>
-          <w:color w:val="FF0000"/>
-        </w:rPr>
-        <w:t>. I think once they do this on all genomes an appropriate threshold will become obvious.</w:t>
-      </w:r>
-    </w:p>
-    <w:p>
-      <w:pPr>
-        <w:rPr>
-          <w:color w:val="FF0000"/>
-        </w:rPr>
-      </w:pPr>
-    </w:p>
-    <w:p>
-      <w:pPr>
-        <w:rPr>
-          <w:color w:val="4C94D8" w:themeColor="text2" w:themeTint="80"/>
-        </w:rPr>
-      </w:pPr>
-      <w:r>
-        <w:rPr>
-          <w:color w:val="4C94D8" w:themeColor="text2" w:themeTint="80"/>
-        </w:rPr>
-        <w:sym w:font="Wingdings" w:char="F0E0"/>
-      </w:r>
-      <w:r>
-        <w:rPr>
-          <w:color w:val="4C94D8" w:themeColor="text2" w:themeTint="80"/>
-        </w:rPr>
-        <w:t xml:space="preserve"> </w:t>
-      </w:r>
-      <w:r>
-        <w:rPr>
-          <w:color w:val="4C94D8" w:themeColor="text2" w:themeTint="80"/>
-        </w:rPr>
-        <w:t>Nice!</w:t>
-      </w:r>
-      <w:r>
-        <w:rPr>
-          <w:color w:val="4C94D8" w:themeColor="text2" w:themeTint="80"/>
-        </w:rPr>
-        <w:t xml:space="preserve"> </w:t>
-      </w:r>
-    </w:p>
-    <w:p>
-      <w:pPr>
-        <w:rPr>
-          <w:color w:val="4C94D8" w:themeColor="text2" w:themeTint="80"/>
-        </w:rPr>
-      </w:pPr>
-    </w:p>
-    <w:p/>
-    <w:p>
-      <w:pPr>
-        <w:rPr>
-          <w:b/>
-          <w:i/>
-        </w:rPr>
-      </w:pPr>
-      <w:r>
-        <w:rPr>
-          <w:b/>
-          <w:i/>
-        </w:rPr>
-        <w:t>Step 2.4.</w:t>
       </w:r>
     </w:p>
     <w:p>
@@ -2543,6 +2140,7 @@
         </w:numPr>
       </w:pPr>
       <w:r>
+        <w:lastRenderedPageBreak/>
         <w:t xml:space="preserve">Very high hits = possibly false duplication. Note, taking the flanking region will help to differentiate whether they are real inserts or false duplicates (if they are false duplicates, I expect the whole region to be very similar). </w:t>
       </w:r>
     </w:p>
@@ -2557,6 +2155,17 @@
       <w:r>
         <w:t>Relatively high hits = real duplication</w:t>
       </w:r>
+      <w:r>
+        <w:t xml:space="preserve">, or independent inserts of the same </w:t>
+      </w:r>
+      <w:proofErr w:type="spellStart"/>
+      <w:r>
+        <w:t>Blattabacterium</w:t>
+      </w:r>
+      <w:proofErr w:type="spellEnd"/>
+      <w:r>
+        <w:t xml:space="preserve"> region.</w:t>
+      </w:r>
     </w:p>
     <w:p>
       <w:pPr>
@@ -2573,216 +2182,465 @@
     <w:p/>
     <w:p>
       <w:r>
-        <w:t xml:space="preserve">Duplicates should then be removed from the putative inserts file so we can count them correctly and age them. To classify </w:t>
-      </w:r>
-      <w:r>
+        <w:t xml:space="preserve">Duplicates should then be removed from the putative inserts file so we can count them correctly and age them. To </w:t>
+      </w:r>
+      <w:r>
+        <w:rPr>
+          <w:color w:val="000000" w:themeColor="text1"/>
+        </w:rPr>
+        <w:t xml:space="preserve">classify </w:t>
+      </w:r>
+      <w:r>
+        <w:rPr>
+          <w:color w:val="000000" w:themeColor="text1"/>
+        </w:rPr>
+        <w:t xml:space="preserve">as </w:t>
+      </w:r>
+      <w:r>
+        <w:rPr>
+          <w:color w:val="000000" w:themeColor="text1"/>
+        </w:rPr>
+        <w:t xml:space="preserve">a duplicate </w:t>
+      </w:r>
+      <w:r>
+        <w:t xml:space="preserve">insert, we could use BLAST thresholds &gt;70% identity and &gt;70% query coverage. Then for each set of duplicates, we can just select one randomly to </w:t>
+      </w:r>
+      <w:r>
+        <w:t>carry on to subsequent analysis.</w:t>
+      </w:r>
+    </w:p>
+    <w:p/>
+    <w:p>
+      <w:r>
+        <w:t>This can be done</w:t>
+      </w:r>
+      <w:r>
+        <w:t xml:space="preserve"> with the following script I made:</w:t>
+      </w:r>
+    </w:p>
+    <w:p>
+      <w:pPr>
+        <w:rPr>
+          <w:i/>
+          <w:iCs/>
+        </w:rPr>
+      </w:pPr>
+      <w:r>
+        <w:rPr>
+          <w:i/>
+          <w:iCs/>
+        </w:rPr>
+        <w:t>2.</w:t>
+      </w:r>
+      <w:r>
+        <w:rPr>
+          <w:i/>
+          <w:iCs/>
+        </w:rPr>
+        <w:t>3</w:t>
+      </w:r>
+      <w:r>
+        <w:rPr>
+          <w:i/>
+          <w:iCs/>
+        </w:rPr>
+        <w:t>.identifying-duplicates.sh</w:t>
+      </w:r>
+    </w:p>
+    <w:p/>
+    <w:p>
+      <w:pPr>
+        <w:rPr>
+          <w:color w:val="FF0000"/>
+        </w:rPr>
+      </w:pPr>
+      <w:r>
+        <w:rPr>
+          <w:color w:val="FF0000"/>
+        </w:rPr>
+        <w:t xml:space="preserve">Does this sound like a reasonable approach? </w:t>
+      </w:r>
+    </w:p>
+    <w:p>
+      <w:pPr>
+        <w:rPr>
+          <w:color w:val="FF0000"/>
+        </w:rPr>
+      </w:pPr>
+      <w:r>
+        <w:rPr>
+          <w:color w:val="FF0000"/>
+        </w:rPr>
+        <w:t xml:space="preserve">What do you think about the thresholds? Does 300 bp flanking on either side sound okay? Do you think a hit should be considered a duplicate if it is </w:t>
+      </w:r>
+      <w:r>
+        <w:rPr>
+          <w:color w:val="FF0000"/>
+        </w:rPr>
+        <w:t>&gt;70% identity and &gt;70% query coverage</w:t>
+      </w:r>
+      <w:r>
+        <w:rPr>
+          <w:color w:val="FF0000"/>
+        </w:rPr>
+        <w:t xml:space="preserve">? Do you think we can just pull out one </w:t>
+      </w:r>
+      <w:r>
+        <w:rPr>
+          <w:color w:val="FF0000"/>
+        </w:rPr>
+        <w:t>insert of a set of duplicates for subsequent analysis</w:t>
+      </w:r>
+      <w:r>
+        <w:rPr>
+          <w:color w:val="FF0000"/>
+        </w:rPr>
+        <w:t>?</w:t>
+      </w:r>
+    </w:p>
+    <w:p>
+      <w:pPr>
+        <w:rPr>
+          <w:color w:val="FF0000"/>
+        </w:rPr>
+      </w:pPr>
+    </w:p>
+    <w:p>
+      <w:pPr>
         <w:rPr>
           <w:color w:val="4C94D8" w:themeColor="text2" w:themeTint="80"/>
         </w:rPr>
-        <w:t>as</w:t>
-      </w:r>
-      <w:r>
-        <w:t xml:space="preserve"> </w:t>
-      </w:r>
-      <w:r>
-        <w:t xml:space="preserve">a duplicate insert, we could use BLAST thresholds &gt;70% identity and &gt;70% query coverage. Then for each set of duplicates, we can just select one randomly to </w:t>
-      </w:r>
-      <w:r>
-        <w:t>carry on to subsequent analysis.</w:t>
+      </w:pPr>
+      <w:r>
+        <w:rPr>
+          <w:color w:val="4C94D8" w:themeColor="text2" w:themeTint="80"/>
+        </w:rPr>
+        <w:sym w:font="Wingdings" w:char="F0E0"/>
+      </w:r>
+      <w:r>
+        <w:rPr>
+          <w:color w:val="4C94D8" w:themeColor="text2" w:themeTint="80"/>
+        </w:rPr>
+        <w:t xml:space="preserve"> </w:t>
+      </w:r>
+      <w:proofErr w:type="gramStart"/>
+      <w:r>
+        <w:rPr>
+          <w:color w:val="4C94D8" w:themeColor="text2" w:themeTint="80"/>
+        </w:rPr>
+        <w:t>Yes</w:t>
+      </w:r>
+      <w:proofErr w:type="gramEnd"/>
+      <w:r>
+        <w:rPr>
+          <w:color w:val="4C94D8" w:themeColor="text2" w:themeTint="80"/>
+        </w:rPr>
+        <w:t xml:space="preserve"> for the first four questions. For the fifth, we might want to pull out more than one hit, because we might discover an insert that is present across all </w:t>
+      </w:r>
+      <w:proofErr w:type="spellStart"/>
+      <w:r>
+        <w:rPr>
+          <w:color w:val="4C94D8" w:themeColor="text2" w:themeTint="80"/>
+        </w:rPr>
+        <w:t>Panesthiinae</w:t>
+      </w:r>
+      <w:proofErr w:type="spellEnd"/>
+      <w:r>
+        <w:rPr>
+          <w:color w:val="4C94D8" w:themeColor="text2" w:themeTint="80"/>
+        </w:rPr>
+        <w:t>/</w:t>
+      </w:r>
+      <w:proofErr w:type="spellStart"/>
+      <w:r>
+        <w:rPr>
+          <w:color w:val="4C94D8" w:themeColor="text2" w:themeTint="80"/>
+        </w:rPr>
+        <w:t>Geoscapheinae</w:t>
+      </w:r>
+      <w:proofErr w:type="spellEnd"/>
+      <w:r>
+        <w:rPr>
+          <w:color w:val="4C94D8" w:themeColor="text2" w:themeTint="80"/>
+        </w:rPr>
+        <w:t xml:space="preserve"> species (or perhaps across all cockroaches!). If there are any inserts that are ultra-conservative, I guess they should show up in all analyses as having several hits. Maybe we could use “number of hits in other species” to determine how old they are?</w:t>
+      </w:r>
+    </w:p>
+    <w:p>
+      <w:pPr>
+        <w:rPr>
+          <w:color w:val="FF0000"/>
+        </w:rPr>
+      </w:pPr>
+    </w:p>
+    <w:p>
+      <w:pPr>
+        <w:rPr>
+          <w:b/>
+          <w:bCs/>
+          <w:i/>
+          <w:iCs/>
+        </w:rPr>
+      </w:pPr>
+      <w:r>
+        <w:rPr>
+          <w:b/>
+          <w:bCs/>
+          <w:i/>
+          <w:iCs/>
+        </w:rPr>
+        <w:t>Step 2.4.</w:t>
+      </w:r>
+    </w:p>
+    <w:p>
+      <w:r>
+        <w:t>Remove hits that are &gt;90% identity and 90% query coverage, as these could be false duplicates.</w:t>
       </w:r>
     </w:p>
     <w:p/>
     <w:p>
       <w:r>
-        <w:t>This can be done</w:t>
-      </w:r>
-      <w:r>
-        <w:t xml:space="preserve"> with the following script I made:</w:t>
-      </w:r>
-    </w:p>
-    <w:p>
-      <w:pPr>
-        <w:rPr>
-          <w:i/>
-          <w:iCs/>
-        </w:rPr>
-      </w:pPr>
-      <w:r>
-        <w:rPr>
-          <w:i/>
-          <w:iCs/>
-        </w:rPr>
-        <w:t>2.4.identifying-duplicates.sh</w:t>
+        <w:rPr>
+          <w:highlight w:val="yellow"/>
+        </w:rPr>
+        <w:t xml:space="preserve">Make this script </w:t>
+      </w:r>
+      <w:r>
+        <w:rPr>
+          <w:highlight w:val="yellow"/>
+        </w:rPr>
+        <w:sym w:font="Wingdings" w:char="F0E0"/>
+      </w:r>
+      <w:r>
+        <w:rPr>
+          <w:highlight w:val="yellow"/>
+        </w:rPr>
+        <w:t xml:space="preserve"> note, I may need to iterate steps 2.3 and this command until there are not hits above 90%/90%.</w:t>
       </w:r>
     </w:p>
     <w:p/>
     <w:p>
+      <w:r>
+        <w:t>Run th</w:t>
+      </w:r>
+      <w:r>
+        <w:t>e following</w:t>
+      </w:r>
+      <w:r>
+        <w:t xml:space="preserve"> command to count how many of the remaining hits are above </w:t>
+      </w:r>
+      <w:r>
+        <w:t>&gt;</w:t>
+      </w:r>
+      <w:r>
+        <w:t>7</w:t>
+      </w:r>
+      <w:r>
+        <w:t xml:space="preserve">0% identity and </w:t>
+      </w:r>
+      <w:r>
+        <w:t>7</w:t>
+      </w:r>
+      <w:r>
+        <w:t>0% query coverage</w:t>
+      </w:r>
+      <w:r>
+        <w:t xml:space="preserve">. </w:t>
+      </w:r>
+      <w:r>
+        <w:t xml:space="preserve">These may either real duplication events, or independent inserts of the same </w:t>
+      </w:r>
+      <w:proofErr w:type="spellStart"/>
+      <w:r>
+        <w:t>Blattabacterium</w:t>
+      </w:r>
+      <w:proofErr w:type="spellEnd"/>
+      <w:r>
+        <w:t xml:space="preserve"> region. These should be excluded from the overall count of insert events (though this is conservative, as independent insertions of the same region should be counted), but we can move forward and age these inserts.</w:t>
+      </w:r>
+    </w:p>
+    <w:p/>
+    <w:p>
+      <w:pPr>
+        <w:rPr>
+          <w:highlight w:val="yellow"/>
+        </w:rPr>
+      </w:pPr>
+      <w:r>
+        <w:rPr>
+          <w:highlight w:val="yellow"/>
+        </w:rPr>
+        <w:t>Command…</w:t>
+      </w:r>
+    </w:p>
+    <w:p>
+      <w:r>
+        <w:rPr>
+          <w:highlight w:val="yellow"/>
+        </w:rPr>
+        <w:t xml:space="preserve">What if </w:t>
+      </w:r>
+      <w:r>
+        <w:rPr>
+          <w:highlight w:val="yellow"/>
+        </w:rPr>
+        <w:t>there is more than a pair of duplicates??</w:t>
+      </w:r>
+    </w:p>
+    <w:p/>
+    <w:p/>
+    <w:p>
+      <w:pPr>
+        <w:rPr>
+          <w:b/>
+          <w:bCs/>
+          <w:i/>
+          <w:iCs/>
+        </w:rPr>
+      </w:pPr>
+      <w:r>
+        <w:rPr>
+          <w:b/>
+          <w:bCs/>
+          <w:i/>
+          <w:iCs/>
+        </w:rPr>
+        <w:t xml:space="preserve">Step </w:t>
+      </w:r>
+      <w:r>
+        <w:rPr>
+          <w:b/>
+          <w:bCs/>
+          <w:i/>
+          <w:iCs/>
+        </w:rPr>
+        <w:t>2.</w:t>
+      </w:r>
+      <w:r>
+        <w:rPr>
+          <w:b/>
+          <w:bCs/>
+          <w:i/>
+          <w:iCs/>
+        </w:rPr>
+        <w:t>5</w:t>
+      </w:r>
+      <w:r>
+        <w:rPr>
+          <w:b/>
+          <w:bCs/>
+          <w:i/>
+          <w:iCs/>
+        </w:rPr>
+        <w:t>.</w:t>
+      </w:r>
+    </w:p>
+    <w:p>
+      <w:r>
+        <w:lastRenderedPageBreak/>
+        <w:t>The genome annotation (when available) was used to annotate the chunks as intergenic or within a gene (and what feature of the gene).</w:t>
+      </w:r>
+    </w:p>
+    <w:p/>
+    <w:p>
+      <w:r>
+        <w:t>I did this with the following script I made:</w:t>
+      </w:r>
+    </w:p>
+    <w:p>
+      <w:pPr>
+        <w:rPr>
+          <w:i/>
+          <w:iCs/>
+        </w:rPr>
+      </w:pPr>
+      <w:r>
+        <w:rPr>
+          <w:i/>
+          <w:iCs/>
+        </w:rPr>
+        <w:t>2.</w:t>
+      </w:r>
+      <w:r>
+        <w:rPr>
+          <w:i/>
+          <w:iCs/>
+        </w:rPr>
+        <w:t>5</w:t>
+      </w:r>
+      <w:r>
+        <w:rPr>
+          <w:i/>
+          <w:iCs/>
+        </w:rPr>
+        <w:t>.annotating-bed.sh</w:t>
+      </w:r>
+    </w:p>
+    <w:p>
       <w:pPr>
         <w:rPr>
           <w:color w:val="FF0000"/>
         </w:rPr>
       </w:pPr>
-      <w:r>
-        <w:rPr>
-          <w:color w:val="FF0000"/>
-        </w:rPr>
-        <w:t xml:space="preserve">Does this sound like a reasonable approach? </w:t>
-      </w:r>
-    </w:p>
-    <w:p>
-      <w:pPr>
-        <w:rPr>
-          <w:color w:val="FF0000"/>
-        </w:rPr>
-      </w:pPr>
-      <w:r>
-        <w:rPr>
-          <w:color w:val="FF0000"/>
-        </w:rPr>
-        <w:t xml:space="preserve">What do you think about the thresholds? Does 300 bp flanking on either side sound okay? Do you think a hit should be considered a duplicate if it is </w:t>
-      </w:r>
-      <w:r>
-        <w:rPr>
-          <w:color w:val="FF0000"/>
-        </w:rPr>
-        <w:t xml:space="preserve">&gt;70% identity and &gt;70% </w:t>
-      </w:r>
-      <w:r>
-        <w:rPr>
-          <w:color w:val="FF0000"/>
-        </w:rPr>
-        <w:lastRenderedPageBreak/>
-        <w:t>query coverage</w:t>
-      </w:r>
-      <w:r>
-        <w:rPr>
-          <w:color w:val="FF0000"/>
-        </w:rPr>
-        <w:t xml:space="preserve">? Do you think we can just pull out one </w:t>
-      </w:r>
-      <w:r>
-        <w:rPr>
-          <w:color w:val="FF0000"/>
-        </w:rPr>
-        <w:t>insert of a set of duplicates for subsequent analysis</w:t>
-      </w:r>
-      <w:r>
-        <w:rPr>
-          <w:color w:val="FF0000"/>
-        </w:rPr>
-        <w:t>?</w:t>
-      </w:r>
-    </w:p>
-    <w:p>
-      <w:pPr>
-        <w:rPr>
-          <w:color w:val="FF0000"/>
-        </w:rPr>
-      </w:pPr>
-    </w:p>
-    <w:p>
-      <w:pPr>
-        <w:rPr>
-          <w:color w:val="4C94D8" w:themeColor="text2" w:themeTint="80"/>
-        </w:rPr>
-      </w:pPr>
-      <w:r>
-        <w:rPr>
-          <w:color w:val="4C94D8" w:themeColor="text2" w:themeTint="80"/>
-        </w:rPr>
-        <w:sym w:font="Wingdings" w:char="F0E0"/>
-      </w:r>
-      <w:r>
-        <w:rPr>
-          <w:color w:val="4C94D8" w:themeColor="text2" w:themeTint="80"/>
-        </w:rPr>
-        <w:t xml:space="preserve"> </w:t>
+    </w:p>
+    <w:p>
+      <w:pPr>
+        <w:rPr>
+          <w:b/>
+          <w:color w:val="000000" w:themeColor="text1"/>
+        </w:rPr>
+      </w:pPr>
+    </w:p>
+    <w:p>
+      <w:pPr>
+        <w:rPr>
+          <w:b/>
+          <w:color w:val="000000" w:themeColor="text1"/>
+        </w:rPr>
+      </w:pPr>
+      <w:r>
+        <w:rPr>
+          <w:b/>
+          <w:color w:val="000000" w:themeColor="text1"/>
+        </w:rPr>
+        <w:t xml:space="preserve">After this section, we will have output files </w:t>
+      </w:r>
+      <w:r>
+        <w:rPr>
+          <w:b/>
+          <w:color w:val="000000" w:themeColor="text1"/>
+        </w:rPr>
+        <w:t xml:space="preserve">that </w:t>
+      </w:r>
+      <w:r>
+        <w:rPr>
+          <w:b/>
+          <w:color w:val="000000" w:themeColor="text1"/>
+        </w:rPr>
+        <w:t xml:space="preserve">can be used to count the putative inserts per </w:t>
       </w:r>
       <w:proofErr w:type="gramStart"/>
       <w:r>
         <w:rPr>
-          <w:color w:val="4C94D8" w:themeColor="text2" w:themeTint="80"/>
-        </w:rPr>
-        <w:t>Yes</w:t>
+          <w:b/>
+          <w:color w:val="000000" w:themeColor="text1"/>
+        </w:rPr>
+        <w:t>genome</w:t>
+      </w:r>
+      <w:r>
+        <w:rPr>
+          <w:b/>
+          <w:color w:val="000000" w:themeColor="text1"/>
+        </w:rPr>
+        <w:t>, and</w:t>
       </w:r>
       <w:proofErr w:type="gramEnd"/>
       <w:r>
         <w:rPr>
-          <w:color w:val="4C94D8" w:themeColor="text2" w:themeTint="80"/>
-        </w:rPr>
-        <w:t xml:space="preserve"> for the first four questions. For the fifth, we might want to pull out more than one hit, because we might discover an insert that is present across all </w:t>
-      </w:r>
-      <w:proofErr w:type="spellStart"/>
-      <w:r>
-        <w:rPr>
-          <w:color w:val="4C94D8" w:themeColor="text2" w:themeTint="80"/>
-        </w:rPr>
-        <w:t>Panesthiinae</w:t>
-      </w:r>
-      <w:proofErr w:type="spellEnd"/>
-      <w:r>
-        <w:rPr>
-          <w:color w:val="4C94D8" w:themeColor="text2" w:themeTint="80"/>
-        </w:rPr>
-        <w:t>/</w:t>
-      </w:r>
-      <w:proofErr w:type="spellStart"/>
-      <w:r>
-        <w:rPr>
-          <w:color w:val="4C94D8" w:themeColor="text2" w:themeTint="80"/>
-        </w:rPr>
-        <w:t>Geoscapheinae</w:t>
-      </w:r>
-      <w:proofErr w:type="spellEnd"/>
-      <w:r>
-        <w:rPr>
-          <w:color w:val="4C94D8" w:themeColor="text2" w:themeTint="80"/>
-        </w:rPr>
-        <w:t xml:space="preserve"> species (or perhaps across all cockroaches!). If there are any inserts that are ultra-conservative, I guess they should show up in all analyses as having several hits. Maybe we could use “number of hits in other species” to determine how old they are?</w:t>
-      </w:r>
-    </w:p>
-    <w:p>
-      <w:pPr>
-        <w:rPr>
-          <w:color w:val="FF0000"/>
-        </w:rPr>
-      </w:pPr>
-    </w:p>
-    <w:p/>
-    <w:p>
-      <w:pPr>
-        <w:rPr>
-          <w:b/>
-          <w:color w:val="FF0000"/>
-        </w:rPr>
-      </w:pPr>
-      <w:r>
-        <w:rPr>
-          <w:b/>
-          <w:color w:val="FF0000"/>
-        </w:rPr>
-        <w:t xml:space="preserve">After this section, we will have output files </w:t>
-      </w:r>
-      <w:r>
-        <w:rPr>
-          <w:b/>
-          <w:color w:val="FF0000"/>
-        </w:rPr>
-        <w:t xml:space="preserve">that </w:t>
-      </w:r>
-      <w:r>
-        <w:rPr>
-          <w:b/>
-          <w:color w:val="FF0000"/>
-        </w:rPr>
-        <w:t>can be used to count the putative inserts per genome</w:t>
-      </w:r>
-      <w:r>
-        <w:rPr>
-          <w:b/>
-          <w:color w:val="FF0000"/>
-        </w:rPr>
-        <w:t>, and identify where in the genome they occur (e.g. intergenic, exon etc.).</w:t>
+          <w:b/>
+          <w:color w:val="000000" w:themeColor="text1"/>
+        </w:rPr>
+        <w:t xml:space="preserve"> identify where in the genome they occur (e.g. intergenic, exon etc.).</w:t>
       </w:r>
     </w:p>
     <w:p>
@@ -2931,14 +2789,6 @@
         </w:rPr>
         <w:t>3.1.extracting-inserts.sh</w:t>
       </w:r>
-    </w:p>
-    <w:p>
-      <w:pPr>
-        <w:rPr>
-          <w:i/>
-          <w:iCs/>
-        </w:rPr>
-      </w:pPr>
     </w:p>
     <w:p>
       <w:pPr>
@@ -3266,9 +3116,165 @@
       </w:r>
     </w:p>
     <w:p>
-      <w:r>
-        <w:t>I then</w:t>
-      </w:r>
+      <w:pPr>
+        <w:rPr>
+          <w:iCs/>
+        </w:rPr>
+      </w:pPr>
+      <w:r>
+        <w:rPr>
+          <w:iCs/>
+        </w:rPr>
+        <w:t xml:space="preserve">First, the two output </w:t>
+      </w:r>
+      <w:r>
+        <w:rPr>
+          <w:iCs/>
+        </w:rPr>
+        <w:t xml:space="preserve">BLAST </w:t>
+      </w:r>
+      <w:r>
+        <w:rPr>
+          <w:iCs/>
+        </w:rPr>
+        <w:t>files from step 3.2 are filtered by query coverage. Hits with query coverage &lt;70% are set to NA. I then combine both files, and set the two % identity alongside each other for each insert. I then calculate the difference between the two % identity:</w:t>
+      </w:r>
+    </w:p>
+    <w:p>
+      <w:pPr>
+        <w:rPr>
+          <w:iCs/>
+        </w:rPr>
+      </w:pPr>
+      <w:r>
+        <w:rPr>
+          <w:iCs/>
+        </w:rPr>
+        <w:t>“</w:t>
+      </w:r>
+      <w:proofErr w:type="spellStart"/>
+      <w:r>
+        <w:rPr>
+          <w:iCs/>
+        </w:rPr>
+        <w:t>Blatta</w:t>
+      </w:r>
+      <w:r>
+        <w:rPr>
+          <w:iCs/>
+        </w:rPr>
+        <w:t>bacterium</w:t>
+      </w:r>
+      <w:proofErr w:type="spellEnd"/>
+      <w:r>
+        <w:rPr>
+          <w:iCs/>
+        </w:rPr>
+        <w:t xml:space="preserve"> </w:t>
+      </w:r>
+      <w:r>
+        <w:rPr>
+          <w:iCs/>
+        </w:rPr>
+        <w:t>BLAST</w:t>
+      </w:r>
+      <w:r>
+        <w:rPr>
+          <w:iCs/>
+        </w:rPr>
+        <w:t xml:space="preserve"> </w:t>
+      </w:r>
+      <w:r>
+        <w:rPr>
+          <w:iCs/>
+        </w:rPr>
+        <w:t>%</w:t>
+      </w:r>
+      <w:r>
+        <w:rPr>
+          <w:iCs/>
+        </w:rPr>
+        <w:t xml:space="preserve"> </w:t>
+      </w:r>
+      <w:r>
+        <w:rPr>
+          <w:iCs/>
+        </w:rPr>
+        <w:t>identity</w:t>
+      </w:r>
+      <w:r>
+        <w:rPr>
+          <w:iCs/>
+        </w:rPr>
+        <w:t>” - “</w:t>
+      </w:r>
+      <w:r>
+        <w:rPr>
+          <w:iCs/>
+        </w:rPr>
+        <w:t>insert</w:t>
+      </w:r>
+      <w:r>
+        <w:rPr>
+          <w:iCs/>
+        </w:rPr>
+        <w:t xml:space="preserve"> </w:t>
+      </w:r>
+      <w:r>
+        <w:rPr>
+          <w:iCs/>
+        </w:rPr>
+        <w:t>d</w:t>
+      </w:r>
+      <w:r>
+        <w:rPr>
+          <w:iCs/>
+        </w:rPr>
+        <w:t xml:space="preserve">atabase </w:t>
+      </w:r>
+      <w:r>
+        <w:rPr>
+          <w:iCs/>
+        </w:rPr>
+        <w:t>BLAST</w:t>
+      </w:r>
+      <w:r>
+        <w:rPr>
+          <w:iCs/>
+        </w:rPr>
+        <w:t xml:space="preserve"> </w:t>
+      </w:r>
+      <w:r>
+        <w:rPr>
+          <w:iCs/>
+        </w:rPr>
+        <w:t>%</w:t>
+      </w:r>
+      <w:r>
+        <w:rPr>
+          <w:iCs/>
+        </w:rPr>
+        <w:t xml:space="preserve"> </w:t>
+      </w:r>
+      <w:r>
+        <w:rPr>
+          <w:iCs/>
+        </w:rPr>
+        <w:t>identity</w:t>
+      </w:r>
+      <w:r>
+        <w:rPr>
+          <w:iCs/>
+        </w:rPr>
+        <w:t>”</w:t>
+      </w:r>
+    </w:p>
+    <w:p>
+      <w:pPr>
+        <w:rPr>
+          <w:iCs/>
+        </w:rPr>
+      </w:pPr>
     </w:p>
     <w:p>
       <w:pPr>
@@ -3281,155 +3287,6 @@
           <w:iCs/>
         </w:rPr>
         <w:lastRenderedPageBreak/>
-        <w:t>First, BLAST hits for the two output files from step 3.2 are filtered by query coverage. Hits with query coverage &lt;70% are set to NA. I then combine both files, and set the two % identity alongside each other for each insert. I then calculate the difference between the two % identity:</w:t>
-      </w:r>
-    </w:p>
-    <w:p>
-      <w:pPr>
-        <w:rPr>
-          <w:iCs/>
-        </w:rPr>
-      </w:pPr>
-      <w:r>
-        <w:rPr>
-          <w:iCs/>
-        </w:rPr>
-        <w:t>“</w:t>
-      </w:r>
-      <w:proofErr w:type="spellStart"/>
-      <w:r>
-        <w:rPr>
-          <w:iCs/>
-        </w:rPr>
-        <w:t>Blatta</w:t>
-      </w:r>
-      <w:r>
-        <w:rPr>
-          <w:iCs/>
-        </w:rPr>
-        <w:t>bacterium</w:t>
-      </w:r>
-      <w:proofErr w:type="spellEnd"/>
-      <w:r>
-        <w:rPr>
-          <w:iCs/>
-        </w:rPr>
-        <w:t xml:space="preserve"> </w:t>
-      </w:r>
-      <w:r>
-        <w:rPr>
-          <w:iCs/>
-        </w:rPr>
-        <w:t>BLAST</w:t>
-      </w:r>
-      <w:r>
-        <w:rPr>
-          <w:iCs/>
-        </w:rPr>
-        <w:t xml:space="preserve"> </w:t>
-      </w:r>
-      <w:r>
-        <w:rPr>
-          <w:iCs/>
-        </w:rPr>
-        <w:t>%</w:t>
-      </w:r>
-      <w:r>
-        <w:rPr>
-          <w:iCs/>
-        </w:rPr>
-        <w:t xml:space="preserve"> </w:t>
-      </w:r>
-      <w:r>
-        <w:rPr>
-          <w:iCs/>
-        </w:rPr>
-        <w:t>identity</w:t>
-      </w:r>
-      <w:r>
-        <w:rPr>
-          <w:iCs/>
-        </w:rPr>
-        <w:t>” - “</w:t>
-      </w:r>
-      <w:r>
-        <w:rPr>
-          <w:iCs/>
-        </w:rPr>
-        <w:t>insert</w:t>
-      </w:r>
-      <w:r>
-        <w:rPr>
-          <w:iCs/>
-        </w:rPr>
-        <w:t xml:space="preserve"> </w:t>
-      </w:r>
-      <w:r>
-        <w:rPr>
-          <w:iCs/>
-        </w:rPr>
-        <w:t>d</w:t>
-      </w:r>
-      <w:r>
-        <w:rPr>
-          <w:iCs/>
-        </w:rPr>
-        <w:t xml:space="preserve">atabase </w:t>
-      </w:r>
-      <w:r>
-        <w:rPr>
-          <w:iCs/>
-        </w:rPr>
-        <w:t>BLAST</w:t>
-      </w:r>
-      <w:r>
-        <w:rPr>
-          <w:iCs/>
-        </w:rPr>
-        <w:t xml:space="preserve"> </w:t>
-      </w:r>
-      <w:r>
-        <w:rPr>
-          <w:iCs/>
-        </w:rPr>
-        <w:t>%</w:t>
-      </w:r>
-      <w:r>
-        <w:rPr>
-          <w:iCs/>
-        </w:rPr>
-        <w:t xml:space="preserve"> </w:t>
-      </w:r>
-      <w:r>
-        <w:rPr>
-          <w:iCs/>
-        </w:rPr>
-        <w:t>identity</w:t>
-      </w:r>
-      <w:r>
-        <w:rPr>
-          <w:iCs/>
-        </w:rPr>
-        <w:t>”</w:t>
-      </w:r>
-    </w:p>
-    <w:p>
-      <w:pPr>
-        <w:rPr>
-          <w:iCs/>
-        </w:rPr>
-      </w:pPr>
-    </w:p>
-    <w:p>
-      <w:pPr>
-        <w:rPr>
-          <w:iCs/>
-        </w:rPr>
-      </w:pPr>
-      <w:r>
-        <w:rPr>
-          <w:iCs/>
-        </w:rPr>
         <w:t xml:space="preserve">A negative value (i.e. low </w:t>
       </w:r>
       <w:proofErr w:type="spellStart"/>
@@ -3777,280 +3634,106 @@
     <w:p>
       <w:pPr>
         <w:rPr>
-          <w:color w:val="FF0000"/>
-        </w:rPr>
-      </w:pPr>
-      <w:r>
-        <w:rPr>
-          <w:color w:val="FF0000"/>
-        </w:rPr>
-        <w:t xml:space="preserve">Does this sound like a reasonable approach? </w:t>
-      </w:r>
-    </w:p>
-    <w:p>
-      <w:pPr>
-        <w:rPr>
-          <w:color w:val="FF0000"/>
-        </w:rPr>
-      </w:pPr>
-      <w:r>
-        <w:rPr>
-          <w:color w:val="FF0000"/>
-        </w:rPr>
-        <w:t xml:space="preserve">Do you filtering based on </w:t>
-      </w:r>
-      <w:r>
-        <w:rPr>
-          <w:color w:val="FF0000"/>
-        </w:rPr>
-        <w:t>query coverage</w:t>
-      </w:r>
-      <w:r>
-        <w:rPr>
-          <w:color w:val="FF0000"/>
-        </w:rPr>
-        <w:t xml:space="preserve"> &lt;70% is reasonable? I used this threshold to be consistent with step 2.4.</w:t>
-      </w:r>
-    </w:p>
-    <w:p>
-      <w:pPr>
-        <w:rPr>
-          <w:color w:val="FF0000"/>
-        </w:rPr>
-      </w:pPr>
-      <w:r>
-        <w:rPr>
-          <w:color w:val="FF0000"/>
-        </w:rPr>
-        <w:t xml:space="preserve">Do you think that for the ancestral inserts we could </w:t>
-      </w:r>
-      <w:proofErr w:type="spellStart"/>
-      <w:r>
-        <w:rPr>
-          <w:color w:val="FF0000"/>
-        </w:rPr>
-        <w:t>could</w:t>
-      </w:r>
-      <w:proofErr w:type="spellEnd"/>
-      <w:r>
-        <w:rPr>
-          <w:color w:val="FF0000"/>
-        </w:rPr>
-        <w:t xml:space="preserve"> go further any be specific about the minimum based on the BLAST top hit of the insert database (i.e. all cockroach inserts) – for example, if </w:t>
-      </w:r>
-      <w:proofErr w:type="spellStart"/>
-      <w:r>
-        <w:rPr>
-          <w:color w:val="FF0000"/>
-        </w:rPr>
-        <w:t>BLASTing</w:t>
-      </w:r>
-      <w:proofErr w:type="spellEnd"/>
-      <w:r>
-        <w:rPr>
-          <w:color w:val="FF0000"/>
-        </w:rPr>
-        <w:t xml:space="preserve"> a </w:t>
-      </w:r>
-      <w:r>
-        <w:rPr>
-          <w:i/>
-          <w:color w:val="FF0000"/>
-        </w:rPr>
-        <w:t xml:space="preserve">P. </w:t>
-      </w:r>
-      <w:proofErr w:type="spellStart"/>
-      <w:r>
-        <w:rPr>
-          <w:i/>
-          <w:color w:val="FF0000"/>
-        </w:rPr>
-        <w:t>cribrata</w:t>
-      </w:r>
-      <w:proofErr w:type="spellEnd"/>
-      <w:r>
-        <w:rPr>
-          <w:color w:val="FF0000"/>
-        </w:rPr>
-        <w:t xml:space="preserve"> insert, and the top hit is </w:t>
-      </w:r>
-      <w:r>
-        <w:rPr>
-          <w:i/>
-          <w:color w:val="FF0000"/>
-        </w:rPr>
-        <w:t xml:space="preserve">N. </w:t>
-      </w:r>
-      <w:proofErr w:type="spellStart"/>
-      <w:r>
-        <w:rPr>
-          <w:i/>
-          <w:color w:val="FF0000"/>
-        </w:rPr>
-        <w:t>hanni</w:t>
-      </w:r>
-      <w:proofErr w:type="spellEnd"/>
-      <w:r>
-        <w:rPr>
-          <w:color w:val="FF0000"/>
-        </w:rPr>
-        <w:t xml:space="preserve">, the minimum age of the insert is the diverge date of </w:t>
-      </w:r>
-      <w:r>
-        <w:rPr>
-          <w:i/>
-          <w:color w:val="FF0000"/>
-        </w:rPr>
-        <w:t xml:space="preserve">P. </w:t>
-      </w:r>
-      <w:proofErr w:type="spellStart"/>
-      <w:r>
-        <w:rPr>
-          <w:i/>
-          <w:color w:val="FF0000"/>
-        </w:rPr>
-        <w:t>cribrata</w:t>
-      </w:r>
-      <w:proofErr w:type="spellEnd"/>
-      <w:r>
-        <w:rPr>
-          <w:color w:val="FF0000"/>
-        </w:rPr>
-        <w:t xml:space="preserve"> and </w:t>
-      </w:r>
-      <w:r>
-        <w:rPr>
-          <w:i/>
-          <w:color w:val="FF0000"/>
-        </w:rPr>
-        <w:t xml:space="preserve">N. </w:t>
-      </w:r>
-      <w:proofErr w:type="spellStart"/>
-      <w:r>
-        <w:rPr>
-          <w:i/>
-          <w:color w:val="FF0000"/>
-        </w:rPr>
-        <w:t>hanni</w:t>
-      </w:r>
-      <w:proofErr w:type="spellEnd"/>
-      <w:r>
-        <w:rPr>
-          <w:color w:val="FF0000"/>
-        </w:rPr>
-        <w:t>. Is this too much of a stretch? We also might want to consider more than just the top hit for this (as it might hit to numerous other cockroach species’ inserts if it’s ancestral).</w:t>
-      </w:r>
-    </w:p>
-    <w:p>
-      <w:pPr>
-        <w:rPr>
-          <w:color w:val="FF0000"/>
-        </w:rPr>
-      </w:pPr>
-    </w:p>
-    <w:p>
-      <w:pPr>
-        <w:rPr>
-          <w:color w:val="FF0000"/>
-        </w:rPr>
-      </w:pPr>
+          <w:i/>
+          <w:iCs/>
+        </w:rPr>
+      </w:pPr>
+    </w:p>
+    <w:p>
+      <w:pPr>
+        <w:rPr>
+          <w:b/>
+          <w:bCs/>
+          <w:i/>
+          <w:iCs/>
+        </w:rPr>
+      </w:pPr>
+      <w:r>
+        <w:rPr>
+          <w:b/>
+          <w:bCs/>
+          <w:i/>
+          <w:iCs/>
+        </w:rPr>
+        <w:t>Step 3.4.</w:t>
+      </w:r>
+    </w:p>
+    <w:p>
+      <w:r>
+        <w:rPr>
+          <w:highlight w:val="yellow"/>
+        </w:rPr>
+        <w:t xml:space="preserve">Taking the ancestral hits identified in step 3.3, we can BLAST them again to the insert database (excluding its own genome), extract all hits above 70% identity and 70% query coverage for each insert, then extract the unique prefixes (i.e. the species name before the first ‘_’) for each insert. These species names can be added as an additional column. This indicates </w:t>
+      </w:r>
       <w:proofErr w:type="gramStart"/>
       <w:r>
         <w:rPr>
-          <w:color w:val="4C94D8" w:themeColor="text2" w:themeTint="80"/>
-        </w:rPr>
-        <w:t>Yes</w:t>
+          <w:highlight w:val="yellow"/>
+        </w:rPr>
+        <w:t>all of</w:t>
       </w:r>
       <w:proofErr w:type="gramEnd"/>
       <w:r>
         <w:rPr>
-          <w:color w:val="4C94D8" w:themeColor="text2" w:themeTint="80"/>
-        </w:rPr>
-        <w:t xml:space="preserve"> to first two questions. For the 3</w:t>
-      </w:r>
-      <w:r>
-        <w:rPr>
-          <w:color w:val="4C94D8" w:themeColor="text2" w:themeTint="80"/>
-          <w:vertAlign w:val="superscript"/>
-        </w:rPr>
-        <w:t>rd</w:t>
-      </w:r>
-      <w:r>
-        <w:rPr>
-          <w:color w:val="4C94D8" w:themeColor="text2" w:themeTint="80"/>
-        </w:rPr>
-        <w:t xml:space="preserve">, if an insert is ancestral, we’d expect it to be in quite a few of the genomes. It would be odd to see an insert only in P. </w:t>
-      </w:r>
-      <w:proofErr w:type="spellStart"/>
-      <w:r>
-        <w:rPr>
-          <w:color w:val="4C94D8" w:themeColor="text2" w:themeTint="80"/>
-        </w:rPr>
-        <w:t>cribrata</w:t>
-      </w:r>
-      <w:proofErr w:type="spellEnd"/>
-      <w:r>
-        <w:rPr>
-          <w:color w:val="4C94D8" w:themeColor="text2" w:themeTint="80"/>
-        </w:rPr>
-        <w:t xml:space="preserve"> and N. </w:t>
-      </w:r>
-      <w:proofErr w:type="spellStart"/>
-      <w:r>
-        <w:rPr>
-          <w:color w:val="4C94D8" w:themeColor="text2" w:themeTint="80"/>
-        </w:rPr>
-        <w:t>hanni</w:t>
-      </w:r>
-      <w:proofErr w:type="spellEnd"/>
-      <w:r>
-        <w:rPr>
-          <w:color w:val="4C94D8" w:themeColor="text2" w:themeTint="80"/>
-        </w:rPr>
-        <w:t xml:space="preserve">, but none of the others, but I guess it is possible. </w:t>
-      </w:r>
-    </w:p>
-    <w:p>
-      <w:pPr>
-        <w:rPr>
-          <w:i/>
-          <w:iCs/>
-        </w:rPr>
-      </w:pPr>
-    </w:p>
-    <w:p>
-      <w:pPr>
-        <w:rPr>
-          <w:b/>
-          <w:color w:val="FF0000"/>
-        </w:rPr>
-      </w:pPr>
-      <w:r>
-        <w:rPr>
-          <w:b/>
-          <w:color w:val="FF0000"/>
-        </w:rPr>
-        <w:t xml:space="preserve">After this section, we will have output files </w:t>
-      </w:r>
-      <w:r>
-        <w:rPr>
-          <w:b/>
-          <w:color w:val="FF0000"/>
-        </w:rPr>
-        <w:t xml:space="preserve">that can be used to infer the age of the inserts. Several other steps </w:t>
-      </w:r>
-    </w:p>
-    <w:p>
-      <w:pPr>
-        <w:rPr>
-          <w:i/>
-          <w:iCs/>
-        </w:rPr>
-      </w:pPr>
-    </w:p>
-    <w:p>
-      <w:pPr>
-        <w:rPr>
+          <w:highlight w:val="yellow"/>
+        </w:rPr>
+        <w:t xml:space="preserve"> the species this insert is found in, and therefore infers the age of the insert.</w:t>
+      </w:r>
+    </w:p>
+    <w:p>
+      <w:pPr>
+        <w:rPr>
+          <w:b/>
+          <w:bCs/>
+          <w:i/>
+          <w:iCs/>
+        </w:rPr>
+      </w:pPr>
+    </w:p>
+    <w:p>
+      <w:pPr>
+        <w:rPr>
+          <w:b/>
+          <w:bCs/>
+          <w:i/>
+          <w:iCs/>
+        </w:rPr>
+      </w:pPr>
+    </w:p>
+    <w:p>
+      <w:pPr>
+        <w:rPr>
+          <w:b/>
+          <w:i/>
+          <w:iCs/>
+          <w:color w:val="000000" w:themeColor="text1"/>
+        </w:rPr>
+      </w:pPr>
+      <w:r>
+        <w:rPr>
+          <w:b/>
+          <w:i/>
+          <w:iCs/>
+          <w:color w:val="000000" w:themeColor="text1"/>
+        </w:rPr>
+        <w:t xml:space="preserve">After this section, we will have output files that can be used to infer the age of the inserts. </w:t>
+      </w:r>
+    </w:p>
+    <w:p>
+      <w:pPr>
+        <w:rPr>
+          <w:b/>
+          <w:bCs/>
+          <w:i/>
+          <w:iCs/>
+        </w:rPr>
+      </w:pPr>
+    </w:p>
+    <w:p>
+      <w:pPr>
+        <w:rPr>
+          <w:b/>
+          <w:bCs/>
           <w:i/>
           <w:iCs/>
         </w:rPr>
@@ -4087,6 +3770,7 @@
           <w:bCs/>
           <w:iCs/>
         </w:rPr>
+        <w:lastRenderedPageBreak/>
         <w:t>Other key things that need to be done:</w:t>
       </w:r>
     </w:p>
@@ -4148,185 +3832,12 @@
     </w:p>
     <w:p>
       <w:pPr>
-        <w:pStyle w:val="ListParagraph"/>
-        <w:numPr>
-          <w:ilvl w:val="0"/>
-          <w:numId w:val="1"/>
-        </w:numPr>
-        <w:rPr>
-          <w:bCs/>
-          <w:iCs/>
-        </w:rPr>
-      </w:pPr>
-      <w:r>
-        <w:rPr>
-          <w:bCs/>
-          <w:iCs/>
-        </w:rPr>
-        <w:t xml:space="preserve">Re-assembling some </w:t>
-      </w:r>
-      <w:r>
-        <w:rPr>
-          <w:bCs/>
-          <w:i/>
-          <w:iCs/>
-        </w:rPr>
-        <w:t>P. americana</w:t>
-      </w:r>
-      <w:r>
-        <w:rPr>
-          <w:bCs/>
-          <w:iCs/>
-        </w:rPr>
-        <w:t>/</w:t>
-      </w:r>
-      <w:r>
-        <w:rPr>
-          <w:bCs/>
-          <w:i/>
-          <w:iCs/>
-        </w:rPr>
-        <w:t xml:space="preserve">B. germanica </w:t>
-      </w:r>
-      <w:r>
-        <w:rPr>
-          <w:bCs/>
-          <w:iCs/>
-        </w:rPr>
-        <w:t>to confirm they do indeed have very few inserts compared to Blaberids.</w:t>
-      </w:r>
-    </w:p>
-    <w:p>
-      <w:pPr>
-        <w:rPr>
-          <w:bCs/>
-          <w:iCs/>
-        </w:rPr>
-      </w:pPr>
-    </w:p>
-    <w:p>
-      <w:pPr>
-        <w:rPr>
-          <w:bCs/>
-          <w:iCs/>
-          <w:color w:val="FF0000"/>
-        </w:rPr>
-      </w:pPr>
-      <w:r>
-        <w:rPr>
-          <w:bCs/>
-          <w:iCs/>
-          <w:color w:val="FF0000"/>
-        </w:rPr>
-        <w:t xml:space="preserve">Do you agree with the above steps? The first two points might have to be done by someone else given my limited time. Note, for point 2, part of the main pipeline is an alignment file, so half of this is done already. </w:t>
-      </w:r>
-    </w:p>
-    <w:p>
-      <w:pPr>
-        <w:rPr>
-          <w:color w:val="FF0000"/>
-        </w:rPr>
-      </w:pPr>
-      <w:r>
-        <w:rPr>
-          <w:color w:val="FF0000"/>
-        </w:rPr>
-        <w:t xml:space="preserve">I am currently re-assembling a </w:t>
-      </w:r>
-      <w:r>
-        <w:rPr>
-          <w:i/>
-          <w:color w:val="FF0000"/>
-        </w:rPr>
-        <w:t>P. americana</w:t>
-      </w:r>
-      <w:r>
-        <w:rPr>
-          <w:color w:val="FF0000"/>
-        </w:rPr>
-        <w:t xml:space="preserve"> with PacBio reads.</w:t>
-      </w:r>
-    </w:p>
-    <w:p>
-      <w:pPr>
-        <w:rPr>
-          <w:color w:val="FF0000"/>
-        </w:rPr>
-      </w:pPr>
-    </w:p>
-    <w:p>
-      <w:pPr>
-        <w:rPr>
-          <w:color w:val="4C94D8" w:themeColor="text2" w:themeTint="80"/>
-        </w:rPr>
-      </w:pPr>
-      <w:r>
-        <w:rPr>
-          <w:color w:val="4C94D8" w:themeColor="text2" w:themeTint="80"/>
-        </w:rPr>
-        <w:t xml:space="preserve">Sounds good. </w:t>
-      </w:r>
-    </w:p>
-    <w:p>
-      <w:pPr>
-        <w:rPr>
-          <w:color w:val="4C94D8" w:themeColor="text2" w:themeTint="80"/>
-        </w:rPr>
-      </w:pPr>
-    </w:p>
-    <w:p>
-      <w:pPr>
-        <w:rPr>
-          <w:color w:val="4C94D8" w:themeColor="text2" w:themeTint="80"/>
-        </w:rPr>
-      </w:pPr>
-      <w:r>
-        <w:rPr>
-          <w:color w:val="4C94D8" w:themeColor="text2" w:themeTint="80"/>
-        </w:rPr>
-        <w:t>Other thoughts:</w:t>
-      </w:r>
-    </w:p>
-    <w:p>
-      <w:pPr>
-        <w:rPr>
-          <w:color w:val="FF0000"/>
-        </w:rPr>
-      </w:pPr>
-      <w:r>
-        <w:rPr>
-          <w:color w:val="4C94D8" w:themeColor="text2" w:themeTint="80"/>
-        </w:rPr>
-        <w:t xml:space="preserve">It would be good to look at whether the origin of the inserts is from particular regions of the </w:t>
-      </w:r>
-      <w:proofErr w:type="spellStart"/>
-      <w:r>
-        <w:rPr>
-          <w:color w:val="4C94D8" w:themeColor="text2" w:themeTint="80"/>
-        </w:rPr>
-        <w:t>Blattabacterium</w:t>
-      </w:r>
-      <w:proofErr w:type="spellEnd"/>
-      <w:r>
-        <w:rPr>
-          <w:color w:val="4C94D8" w:themeColor="text2" w:themeTint="80"/>
-        </w:rPr>
-        <w:t xml:space="preserve"> genome, or whether they </w:t>
-      </w:r>
-      <w:r>
-        <w:rPr>
-          <w:color w:val="4C94D8" w:themeColor="text2" w:themeTint="80"/>
-        </w:rPr>
-        <w:t>come from any area of genome, randomly</w:t>
-      </w:r>
-      <w:r>
-        <w:rPr>
-          <w:color w:val="4C94D8" w:themeColor="text2" w:themeTint="80"/>
-        </w:rPr>
-        <w:t xml:space="preserve">. </w:t>
-      </w:r>
-    </w:p>
-    <w:p/>
+        <w:rPr>
+          <w:bCs/>
+          <w:iCs/>
+        </w:rPr>
+      </w:pPr>
+    </w:p>
     <w:p/>
     <w:sectPr>
       <w:pgSz w:w="11906" w:h="16838"/>

</xml_diff>

<commit_message>
Updated HGT pipeline doc
</commit_message>
<xml_diff>
--- a/HGT_pipeline.docx
+++ b/HGT_pipeline.docx
@@ -1090,7 +1090,10 @@
           <w:i/>
           <w:iCs/>
         </w:rPr>
-        <w:t xml:space="preserve"> americana</w:t>
+        <w:t xml:space="preserve"> americana </w:t>
+      </w:r>
+      <w:r>
+        <w:t>v1</w:t>
       </w:r>
       <w:r>
         <w:rPr>
@@ -1103,10 +1106,7 @@
         <w:sym w:font="Wingdings" w:char="F0E0"/>
       </w:r>
       <w:r>
-        <w:t xml:space="preserve"> </w:t>
-      </w:r>
-      <w:r>
-        <w:t>GCA_025594305.2</w:t>
+        <w:t xml:space="preserve"> GCA_025594305.2</w:t>
       </w:r>
     </w:p>
     <w:p>
@@ -1118,11 +1118,16 @@
         </w:numPr>
       </w:pPr>
       <w:r>
-        <w:t xml:space="preserve">from </w:t>
-      </w:r>
-      <w:r>
-        <w:t>NCBI</w:t>
-      </w:r>
+        <w:t>f</w:t>
+      </w:r>
+      <w:r>
+        <w:t xml:space="preserve">rom </w:t>
+      </w:r>
+      <w:proofErr w:type="spellStart"/>
+      <w:r>
+        <w:t>Genbank</w:t>
+      </w:r>
+      <w:proofErr w:type="spellEnd"/>
     </w:p>
     <w:p>
       <w:pPr>
@@ -1170,7 +1175,14 @@
           <w:i/>
           <w:iCs/>
         </w:rPr>
-        <w:t>Periplaneta_</w:t>
+        <w:t>Periplaneta</w:t>
+      </w:r>
+      <w:r>
+        <w:rPr>
+          <w:i/>
+          <w:iCs/>
+        </w:rPr>
+        <w:t>_</w:t>
       </w:r>
       <w:proofErr w:type="gramStart"/>
       <w:r>
@@ -1232,19 +1244,13 @@
         <w:t xml:space="preserve"> americana</w:t>
       </w:r>
       <w:r>
-        <w:t xml:space="preserve"> v</w:t>
-      </w:r>
-      <w:r>
-        <w:t xml:space="preserve">3 </w:t>
+        <w:t xml:space="preserve"> v3 </w:t>
       </w:r>
       <w:r>
         <w:sym w:font="Wingdings" w:char="F0E0"/>
       </w:r>
       <w:r>
-        <w:t xml:space="preserve"> </w:t>
-      </w:r>
-      <w:r>
-        <w:t>CNA0019281</w:t>
+        <w:t xml:space="preserve"> CNA0019281</w:t>
       </w:r>
     </w:p>
     <w:p>
@@ -1256,10 +1262,7 @@
         </w:numPr>
       </w:pPr>
       <w:r>
-        <w:t xml:space="preserve">from CNSA </w:t>
-      </w:r>
-      <w:r>
-        <w:t>(https://db.cngb.org/cnsa/)</w:t>
+        <w:t>from CNSA (https://db.cngb.org/cnsa/)</w:t>
       </w:r>
     </w:p>
     <w:p>
@@ -1730,34 +1733,18 @@
           <w:numId w:val="1"/>
         </w:numPr>
       </w:pPr>
-      <w:proofErr w:type="spellStart"/>
-      <w:r>
-        <w:rPr>
-          <w:i/>
-          <w:iCs/>
-        </w:rPr>
-        <w:t>Tenodera</w:t>
-      </w:r>
-      <w:proofErr w:type="spellEnd"/>
-      <w:r>
-        <w:rPr>
-          <w:i/>
-          <w:iCs/>
-        </w:rPr>
-        <w:t xml:space="preserve"> </w:t>
-      </w:r>
-      <w:r>
-        <w:rPr>
-          <w:i/>
-          <w:iCs/>
-        </w:rPr>
-        <w:t>sinensis</w:t>
-      </w:r>
-      <w:r>
-        <w:rPr>
-          <w:i/>
-          <w:iCs/>
-        </w:rPr>
+      <w:r>
+        <w:t>Reticulitermes</w:t>
+      </w:r>
+      <w:r>
+        <w:t xml:space="preserve"> </w:t>
+      </w:r>
+      <w:proofErr w:type="spellStart"/>
+      <w:r>
+        <w:t>lucifugus</w:t>
+      </w:r>
+      <w:proofErr w:type="spellEnd"/>
+      <w:r>
         <w:t xml:space="preserve"> </w:t>
       </w:r>
       <w:r>
@@ -1766,18 +1753,41 @@
       <w:r>
         <w:t xml:space="preserve"> </w:t>
       </w:r>
-      <w:r>
-        <w:t xml:space="preserve">GCA_030765045.1 </w:t>
-      </w:r>
-      <w:r>
-        <w:t xml:space="preserve">(from </w:t>
-      </w:r>
-      <w:r>
-        <w:t>NCBI</w:t>
-      </w:r>
-      <w:r>
-        <w:t>)</w:t>
-      </w:r>
+      <w:proofErr w:type="spellStart"/>
+      <w:r>
+        <w:rPr>
+          <w:i/>
+          <w:iCs/>
+        </w:rPr>
+        <w:t>Reticulitermes_</w:t>
+      </w:r>
+      <w:proofErr w:type="gramStart"/>
+      <w:r>
+        <w:rPr>
+          <w:i/>
+          <w:iCs/>
+        </w:rPr>
+        <w:t>lucifugus</w:t>
+      </w:r>
+      <w:r>
+        <w:t>.</w:t>
+      </w:r>
+      <w:r>
+        <w:rPr>
+          <w:i/>
+          <w:iCs/>
+        </w:rPr>
+        <w:t>genome</w:t>
+      </w:r>
+      <w:proofErr w:type="gramEnd"/>
+      <w:r>
+        <w:rPr>
+          <w:i/>
+          <w:iCs/>
+        </w:rPr>
+        <w:t>.fasta</w:t>
+      </w:r>
+      <w:proofErr w:type="spellEnd"/>
     </w:p>
     <w:p>
       <w:pPr>
@@ -1788,118 +1798,7 @@
         </w:numPr>
       </w:pPr>
       <w:r>
-        <w:t>No annotation available.</w:t>
-      </w:r>
-    </w:p>
-    <w:p>
-      <w:pPr>
-        <w:rPr>
-          <w:b/>
-          <w:bCs/>
-          <w:iCs/>
-        </w:rPr>
-      </w:pPr>
-    </w:p>
-    <w:p>
-      <w:pPr>
-        <w:rPr>
-          <w:b/>
-          <w:bCs/>
-          <w:iCs/>
-        </w:rPr>
-      </w:pPr>
-      <w:r>
-        <w:rPr>
-          <w:b/>
-          <w:bCs/>
-          <w:iCs/>
-        </w:rPr>
-        <w:t>2</w:t>
-      </w:r>
-      <w:r>
-        <w:rPr>
-          <w:b/>
-          <w:bCs/>
-          <w:iCs/>
-        </w:rPr>
-        <w:t xml:space="preserve">. </w:t>
-      </w:r>
-      <w:r>
-        <w:rPr>
-          <w:b/>
-          <w:bCs/>
-          <w:iCs/>
-        </w:rPr>
-        <w:t>CHARACTERISING INSERTS</w:t>
-      </w:r>
-    </w:p>
-    <w:p>
-      <w:pPr>
-        <w:rPr>
-          <w:b/>
-          <w:bCs/>
-          <w:i/>
-          <w:iCs/>
-        </w:rPr>
-      </w:pPr>
-    </w:p>
-    <w:p>
-      <w:pPr>
-        <w:rPr>
-          <w:b/>
-          <w:bCs/>
-          <w:i/>
-          <w:iCs/>
-        </w:rPr>
-      </w:pPr>
-      <w:r>
-        <w:rPr>
-          <w:b/>
-          <w:bCs/>
-          <w:i/>
-          <w:iCs/>
-        </w:rPr>
-        <w:t xml:space="preserve">Step </w:t>
-      </w:r>
-      <w:r>
-        <w:rPr>
-          <w:b/>
-          <w:bCs/>
-          <w:i/>
-          <w:iCs/>
-        </w:rPr>
-        <w:t>2.1</w:t>
-      </w:r>
-      <w:r>
-        <w:rPr>
-          <w:b/>
-          <w:bCs/>
-          <w:i/>
-          <w:iCs/>
-        </w:rPr>
-        <w:t>.</w:t>
-      </w:r>
-    </w:p>
-    <w:p>
-      <w:r>
-        <w:t>Characteris</w:t>
-      </w:r>
-      <w:r>
-        <w:t>ing</w:t>
-      </w:r>
-      <w:r>
-        <w:t xml:space="preserve"> the putative </w:t>
-      </w:r>
-      <w:r>
-        <w:t xml:space="preserve">HGT regions based on where the </w:t>
-      </w:r>
-      <w:proofErr w:type="spellStart"/>
-      <w:r>
-        <w:t>Blattabacterium</w:t>
-      </w:r>
-      <w:proofErr w:type="spellEnd"/>
-      <w:r>
-        <w:t xml:space="preserve"> chunks aligned.</w:t>
+        <w:t>from InsectBase</w:t>
       </w:r>
     </w:p>
     <w:p>
@@ -1910,8 +1809,182 @@
           <w:numId w:val="1"/>
         </w:numPr>
       </w:pPr>
-      <w:r>
-        <w:t xml:space="preserve">The region was elongated where </w:t>
+      <w:proofErr w:type="spellStart"/>
+      <w:r>
+        <w:rPr>
+          <w:i/>
+          <w:iCs/>
+        </w:rPr>
+        <w:t>Tenodera</w:t>
+      </w:r>
+      <w:proofErr w:type="spellEnd"/>
+      <w:r>
+        <w:rPr>
+          <w:i/>
+          <w:iCs/>
+        </w:rPr>
+        <w:t xml:space="preserve"> </w:t>
+      </w:r>
+      <w:r>
+        <w:rPr>
+          <w:i/>
+          <w:iCs/>
+        </w:rPr>
+        <w:t>sinensis</w:t>
+      </w:r>
+      <w:r>
+        <w:rPr>
+          <w:i/>
+          <w:iCs/>
+        </w:rPr>
+        <w:t xml:space="preserve"> </w:t>
+      </w:r>
+      <w:r>
+        <w:sym w:font="Wingdings" w:char="F0E0"/>
+      </w:r>
+      <w:r>
+        <w:t xml:space="preserve"> </w:t>
+      </w:r>
+      <w:r>
+        <w:t xml:space="preserve">GCA_030765045.1 </w:t>
+      </w:r>
+      <w:r>
+        <w:t xml:space="preserve">(from </w:t>
+      </w:r>
+      <w:r>
+        <w:t>NCBI</w:t>
+      </w:r>
+      <w:r>
+        <w:t>)</w:t>
+      </w:r>
+    </w:p>
+    <w:p>
+      <w:pPr>
+        <w:pStyle w:val="ListParagraph"/>
+        <w:numPr>
+          <w:ilvl w:val="1"/>
+          <w:numId w:val="1"/>
+        </w:numPr>
+        <w:rPr>
+          <w:highlight w:val="yellow"/>
+        </w:rPr>
+      </w:pPr>
+      <w:r>
+        <w:rPr>
+          <w:highlight w:val="yellow"/>
+        </w:rPr>
+        <w:t xml:space="preserve">Not used; but could </w:t>
+      </w:r>
+      <w:proofErr w:type="gramStart"/>
+      <w:r>
+        <w:rPr>
+          <w:highlight w:val="yellow"/>
+        </w:rPr>
+        <w:t>use</w:t>
+      </w:r>
+      <w:proofErr w:type="gramEnd"/>
+    </w:p>
+    <w:p>
+      <w:pPr>
+        <w:rPr>
+          <w:b/>
+          <w:bCs/>
+          <w:iCs/>
+        </w:rPr>
+      </w:pPr>
+    </w:p>
+    <w:p>
+      <w:pPr>
+        <w:rPr>
+          <w:b/>
+          <w:bCs/>
+          <w:iCs/>
+        </w:rPr>
+      </w:pPr>
+      <w:r>
+        <w:rPr>
+          <w:b/>
+          <w:bCs/>
+          <w:iCs/>
+        </w:rPr>
+        <w:t>2</w:t>
+      </w:r>
+      <w:r>
+        <w:rPr>
+          <w:b/>
+          <w:bCs/>
+          <w:iCs/>
+        </w:rPr>
+        <w:t xml:space="preserve">. </w:t>
+      </w:r>
+      <w:r>
+        <w:rPr>
+          <w:b/>
+          <w:bCs/>
+          <w:iCs/>
+        </w:rPr>
+        <w:t>CHARACTERISING INSERTS</w:t>
+      </w:r>
+    </w:p>
+    <w:p>
+      <w:pPr>
+        <w:rPr>
+          <w:b/>
+          <w:bCs/>
+          <w:i/>
+          <w:iCs/>
+        </w:rPr>
+      </w:pPr>
+    </w:p>
+    <w:p>
+      <w:pPr>
+        <w:rPr>
+          <w:b/>
+          <w:bCs/>
+          <w:i/>
+          <w:iCs/>
+        </w:rPr>
+      </w:pPr>
+      <w:r>
+        <w:rPr>
+          <w:b/>
+          <w:bCs/>
+          <w:i/>
+          <w:iCs/>
+        </w:rPr>
+        <w:t xml:space="preserve">Step </w:t>
+      </w:r>
+      <w:r>
+        <w:rPr>
+          <w:b/>
+          <w:bCs/>
+          <w:i/>
+          <w:iCs/>
+        </w:rPr>
+        <w:t>2.1</w:t>
+      </w:r>
+      <w:r>
+        <w:rPr>
+          <w:b/>
+          <w:bCs/>
+          <w:i/>
+          <w:iCs/>
+        </w:rPr>
+        <w:t>.</w:t>
+      </w:r>
+    </w:p>
+    <w:p>
+      <w:r>
+        <w:t>Characteris</w:t>
+      </w:r>
+      <w:r>
+        <w:t>ing</w:t>
+      </w:r>
+      <w:r>
+        <w:t xml:space="preserve"> the putative </w:t>
+      </w:r>
+      <w:r>
+        <w:t xml:space="preserve">HGT regions based on where the </w:t>
       </w:r>
       <w:proofErr w:type="spellStart"/>
       <w:r>
@@ -1919,13 +1992,7 @@
       </w:r>
       <w:proofErr w:type="spellEnd"/>
       <w:r>
-        <w:t xml:space="preserve"> chunks overlapped, or when there was a gap between </w:t>
-      </w:r>
-      <w:r>
-        <w:t xml:space="preserve">neighbouring </w:t>
-      </w:r>
-      <w:r>
-        <w:t>mapped chunks &lt;200 bp.</w:t>
+        <w:t xml:space="preserve"> chunks aligned.</w:t>
       </w:r>
     </w:p>
     <w:p>
@@ -1937,131 +2004,7 @@
         </w:numPr>
       </w:pPr>
       <w:r>
-        <w:t>Putative inserts &lt;75 bp were removed (this would happen</w:t>
-      </w:r>
-      <w:r>
-        <w:t xml:space="preserve"> </w:t>
-      </w:r>
-      <w:r>
-        <w:rPr>
-          <w:color w:val="4C94D8" w:themeColor="text2" w:themeTint="80"/>
-        </w:rPr>
-        <w:t>if</w:t>
-      </w:r>
-      <w:r>
-        <w:t xml:space="preserve"> less than half of one 150 bp chunk aligned)</w:t>
-      </w:r>
-    </w:p>
-    <w:p>
-      <w:r>
-        <w:t>I did this with the following script I made:</w:t>
-      </w:r>
-    </w:p>
-    <w:p>
-      <w:pPr>
-        <w:rPr>
-          <w:i/>
-          <w:iCs/>
-        </w:rPr>
-      </w:pPr>
-      <w:r>
-        <w:rPr>
-          <w:i/>
-          <w:iCs/>
-        </w:rPr>
-        <w:t>2.1.extracting-bed.sh</w:t>
-      </w:r>
-    </w:p>
-    <w:p/>
-    <w:p>
-      <w:pPr>
-        <w:rPr>
-          <w:b/>
-          <w:bCs/>
-          <w:color w:val="000000" w:themeColor="text1"/>
-        </w:rPr>
-      </w:pPr>
-      <w:r>
-        <w:rPr>
-          <w:b/>
-          <w:bCs/>
-          <w:color w:val="000000" w:themeColor="text1"/>
-          <w:highlight w:val="yellow"/>
-        </w:rPr>
-        <w:t xml:space="preserve">Go down to 50 </w:t>
-      </w:r>
-      <w:proofErr w:type="gramStart"/>
-      <w:r>
-        <w:rPr>
-          <w:b/>
-          <w:bCs/>
-          <w:color w:val="000000" w:themeColor="text1"/>
-          <w:highlight w:val="yellow"/>
-        </w:rPr>
-        <w:t>bp</w:t>
-      </w:r>
-      <w:proofErr w:type="gramEnd"/>
-    </w:p>
-    <w:p>
-      <w:pPr>
-        <w:rPr>
-          <w:i/>
-          <w:iCs/>
-        </w:rPr>
-      </w:pPr>
-    </w:p>
-    <w:p>
-      <w:pPr>
-        <w:rPr>
-          <w:b/>
-          <w:bCs/>
-          <w:i/>
-          <w:iCs/>
-        </w:rPr>
-      </w:pPr>
-      <w:r>
-        <w:rPr>
-          <w:b/>
-          <w:bCs/>
-          <w:i/>
-          <w:iCs/>
-        </w:rPr>
-        <w:t xml:space="preserve">Step </w:t>
-      </w:r>
-      <w:r>
-        <w:rPr>
-          <w:b/>
-          <w:bCs/>
-          <w:i/>
-          <w:iCs/>
-        </w:rPr>
-        <w:t>2.</w:t>
-      </w:r>
-      <w:r>
-        <w:rPr>
-          <w:b/>
-          <w:bCs/>
-          <w:i/>
-          <w:iCs/>
-        </w:rPr>
-        <w:t>2</w:t>
-      </w:r>
-      <w:r>
-        <w:rPr>
-          <w:b/>
-          <w:bCs/>
-          <w:i/>
-          <w:iCs/>
-        </w:rPr>
-        <w:t>.</w:t>
-      </w:r>
-    </w:p>
-    <w:p>
-      <w:r>
-        <w:t xml:space="preserve">Filtering </w:t>
-      </w:r>
-      <w:r>
-        <w:t xml:space="preserve">potential contaminant </w:t>
+        <w:t xml:space="preserve">The region was elongated where </w:t>
       </w:r>
       <w:proofErr w:type="spellStart"/>
       <w:r>
@@ -2069,66 +2012,13 @@
       </w:r>
       <w:proofErr w:type="spellEnd"/>
       <w:r>
-        <w:t xml:space="preserve"> contigs that appear as inserts. This is done by comparing the length of the HGT insert and the contig which it sits on. We can remove the insert (and contig) if the insert covers a large proportion (e.g. &gt;40%) of the contig. </w:t>
-      </w:r>
-    </w:p>
-    <w:p/>
-    <w:p/>
-    <w:p>
-      <w:pPr>
-        <w:rPr>
-          <w:b/>
-          <w:i/>
-        </w:rPr>
-      </w:pPr>
-      <w:r>
-        <w:rPr>
-          <w:b/>
-          <w:i/>
-        </w:rPr>
-        <w:t>Step 2.</w:t>
-      </w:r>
-      <w:r>
-        <w:rPr>
-          <w:b/>
-          <w:i/>
-        </w:rPr>
-        <w:t>3</w:t>
-      </w:r>
-      <w:r>
-        <w:rPr>
-          <w:b/>
-          <w:i/>
-        </w:rPr>
-        <w:t>.</w:t>
-      </w:r>
-    </w:p>
-    <w:p>
-      <w:r>
-        <w:t>Some HGT inserts might be the result of a real duplication event, and some might have ‘jumped’ around the genome with a transposon. Further, given that the most common assembly error is false duplication, some duplicate inserts may be artefacts.</w:t>
-      </w:r>
-    </w:p>
-    <w:p/>
-    <w:p>
-      <w:r>
-        <w:t>We need to identify and filter duplicated HGT inserts to correctly count inserts per genome and to characterise their age etc.</w:t>
-      </w:r>
-      <w:r>
-        <w:t xml:space="preserve"> To do this, for each genome, I first extract each insert plus a 300 bp flanking region on either side. I then BLAST each insert (plus flanking region) against all other inserts (plus flanking regions) in the genome. I ignore the top hit, as this will be the insert that I am </w:t>
-      </w:r>
-      <w:proofErr w:type="spellStart"/>
-      <w:r>
-        <w:t>BLASTing</w:t>
-      </w:r>
-      <w:proofErr w:type="spellEnd"/>
-      <w:r>
-        <w:t xml:space="preserve">, and extract the second hit (if there is one). </w:t>
-      </w:r>
-    </w:p>
-    <w:p/>
-    <w:p>
-      <w:r>
-        <w:t>Interpretation:</w:t>
+        <w:t xml:space="preserve"> chunks overlapped, or when there was a gap between </w:t>
+      </w:r>
+      <w:r>
+        <w:t xml:space="preserve">neighbouring </w:t>
+      </w:r>
+      <w:r>
+        <w:t>mapped chunks &lt;200 bp.</w:t>
       </w:r>
     </w:p>
     <w:p>
@@ -2140,8 +2030,198 @@
         </w:numPr>
       </w:pPr>
       <w:r>
-        <w:lastRenderedPageBreak/>
-        <w:t xml:space="preserve">Very high hits = possibly false duplication. Note, taking the flanking region will help to differentiate whether they are real inserts or false duplicates (if they are false duplicates, I expect the whole region to be very similar). </w:t>
+        <w:t>Putative inserts &lt;75 bp were removed (this would happen</w:t>
+      </w:r>
+      <w:r>
+        <w:t xml:space="preserve"> </w:t>
+      </w:r>
+      <w:r>
+        <w:rPr>
+          <w:color w:val="4C94D8" w:themeColor="text2" w:themeTint="80"/>
+        </w:rPr>
+        <w:t>if</w:t>
+      </w:r>
+      <w:r>
+        <w:t xml:space="preserve"> less than half of one 150 bp chunk aligned)</w:t>
+      </w:r>
+    </w:p>
+    <w:p>
+      <w:r>
+        <w:t>I did this with the following script I made:</w:t>
+      </w:r>
+    </w:p>
+    <w:p>
+      <w:pPr>
+        <w:rPr>
+          <w:i/>
+          <w:iCs/>
+        </w:rPr>
+      </w:pPr>
+      <w:r>
+        <w:rPr>
+          <w:i/>
+          <w:iCs/>
+        </w:rPr>
+        <w:t>2.1.extracting-bed.sh</w:t>
+      </w:r>
+    </w:p>
+    <w:p/>
+    <w:p>
+      <w:pPr>
+        <w:rPr>
+          <w:b/>
+          <w:bCs/>
+          <w:color w:val="000000" w:themeColor="text1"/>
+        </w:rPr>
+      </w:pPr>
+      <w:r>
+        <w:rPr>
+          <w:b/>
+          <w:bCs/>
+          <w:color w:val="000000" w:themeColor="text1"/>
+          <w:highlight w:val="yellow"/>
+        </w:rPr>
+        <w:t xml:space="preserve">Go down to 50 </w:t>
+      </w:r>
+      <w:proofErr w:type="gramStart"/>
+      <w:r>
+        <w:rPr>
+          <w:b/>
+          <w:bCs/>
+          <w:color w:val="000000" w:themeColor="text1"/>
+          <w:highlight w:val="yellow"/>
+        </w:rPr>
+        <w:t>bp</w:t>
+      </w:r>
+      <w:proofErr w:type="gramEnd"/>
+    </w:p>
+    <w:p>
+      <w:pPr>
+        <w:rPr>
+          <w:i/>
+          <w:iCs/>
+        </w:rPr>
+      </w:pPr>
+    </w:p>
+    <w:p>
+      <w:pPr>
+        <w:rPr>
+          <w:b/>
+          <w:bCs/>
+          <w:i/>
+          <w:iCs/>
+        </w:rPr>
+      </w:pPr>
+      <w:r>
+        <w:rPr>
+          <w:b/>
+          <w:bCs/>
+          <w:i/>
+          <w:iCs/>
+        </w:rPr>
+        <w:t xml:space="preserve">Step </w:t>
+      </w:r>
+      <w:r>
+        <w:rPr>
+          <w:b/>
+          <w:bCs/>
+          <w:i/>
+          <w:iCs/>
+        </w:rPr>
+        <w:t>2.</w:t>
+      </w:r>
+      <w:r>
+        <w:rPr>
+          <w:b/>
+          <w:bCs/>
+          <w:i/>
+          <w:iCs/>
+        </w:rPr>
+        <w:t>2</w:t>
+      </w:r>
+      <w:r>
+        <w:rPr>
+          <w:b/>
+          <w:bCs/>
+          <w:i/>
+          <w:iCs/>
+        </w:rPr>
+        <w:t>.</w:t>
+      </w:r>
+    </w:p>
+    <w:p>
+      <w:r>
+        <w:t xml:space="preserve">Filtering </w:t>
+      </w:r>
+      <w:r>
+        <w:t xml:space="preserve">potential contaminant </w:t>
+      </w:r>
+      <w:proofErr w:type="spellStart"/>
+      <w:r>
+        <w:t>Blattabacterium</w:t>
+      </w:r>
+      <w:proofErr w:type="spellEnd"/>
+      <w:r>
+        <w:t xml:space="preserve"> contigs that appear as inserts. This is done by comparing the length of the HGT insert and the contig which it sits on. We can remove the insert (and contig) if the insert covers a large proportion (e.g. &gt;40%) of the contig. </w:t>
+      </w:r>
+    </w:p>
+    <w:p/>
+    <w:p/>
+    <w:p>
+      <w:pPr>
+        <w:rPr>
+          <w:b/>
+          <w:i/>
+        </w:rPr>
+      </w:pPr>
+      <w:r>
+        <w:rPr>
+          <w:b/>
+          <w:i/>
+        </w:rPr>
+        <w:t>Step 2.</w:t>
+      </w:r>
+      <w:r>
+        <w:rPr>
+          <w:b/>
+          <w:i/>
+        </w:rPr>
+        <w:t>3</w:t>
+      </w:r>
+      <w:r>
+        <w:rPr>
+          <w:b/>
+          <w:i/>
+        </w:rPr>
+        <w:t>.</w:t>
+      </w:r>
+    </w:p>
+    <w:p>
+      <w:r>
+        <w:t>Some HGT inserts might be the result of a real duplication event, and some might have ‘jumped’ around the genome with a transposon. Further, given that the most common assembly error is false duplication, some duplicate inserts may be artefacts.</w:t>
+      </w:r>
+    </w:p>
+    <w:p/>
+    <w:p>
+      <w:r>
+        <w:t>We need to identify and filter duplicated HGT inserts to correctly count inserts per genome and to characterise their age etc.</w:t>
+      </w:r>
+      <w:r>
+        <w:t xml:space="preserve"> To do this, for each genome, I first extract each insert plus a 300 bp flanking region on either side. I then BLAST each insert (plus flanking region) against all other inserts (plus flanking regions) in the genome. I ignore the top hit, as this will be the insert that I am </w:t>
+      </w:r>
+      <w:proofErr w:type="spellStart"/>
+      <w:r>
+        <w:t>BLASTing</w:t>
+      </w:r>
+      <w:proofErr w:type="spellEnd"/>
+      <w:r>
+        <w:t xml:space="preserve">, and extract the second hit (if there is one). </w:t>
+      </w:r>
+    </w:p>
+    <w:p/>
+    <w:p>
+      <w:r>
+        <w:t>Interpretation:</w:t>
       </w:r>
     </w:p>
     <w:p>
@@ -2153,18 +2233,8 @@
         </w:numPr>
       </w:pPr>
       <w:r>
-        <w:t>Relatively high hits = real duplication</w:t>
-      </w:r>
-      <w:r>
-        <w:t xml:space="preserve">, or independent inserts of the same </w:t>
-      </w:r>
-      <w:proofErr w:type="spellStart"/>
-      <w:r>
-        <w:t>Blattabacterium</w:t>
-      </w:r>
-      <w:proofErr w:type="spellEnd"/>
-      <w:r>
-        <w:t xml:space="preserve"> region.</w:t>
+        <w:lastRenderedPageBreak/>
+        <w:t xml:space="preserve">Very high hits = possibly false duplication. Note, taking the flanking region will help to differentiate whether they are real inserts or false duplicates (if they are false duplicates, I expect the whole region to be very similar). </w:t>
       </w:r>
     </w:p>
     <w:p>
@@ -2176,6 +2246,29 @@
         </w:numPr>
       </w:pPr>
       <w:r>
+        <w:t>Relatively high hits = real duplication</w:t>
+      </w:r>
+      <w:r>
+        <w:t xml:space="preserve">, or independent inserts of the same </w:t>
+      </w:r>
+      <w:proofErr w:type="spellStart"/>
+      <w:r>
+        <w:t>Blattabacterium</w:t>
+      </w:r>
+      <w:proofErr w:type="spellEnd"/>
+      <w:r>
+        <w:t xml:space="preserve"> region.</w:t>
+      </w:r>
+    </w:p>
+    <w:p>
+      <w:pPr>
+        <w:pStyle w:val="ListParagraph"/>
+        <w:numPr>
+          <w:ilvl w:val="0"/>
+          <w:numId w:val="1"/>
+        </w:numPr>
+      </w:pPr>
+      <w:r>
         <w:t>No hits = no duplication</w:t>
       </w:r>
     </w:p>
@@ -2427,25 +2520,7 @@
         <w:t>e following</w:t>
       </w:r>
       <w:r>
-        <w:t xml:space="preserve"> command to count how many of the remaining hits are above </w:t>
-      </w:r>
-      <w:r>
-        <w:t>&gt;</w:t>
-      </w:r>
-      <w:r>
-        <w:t>7</w:t>
-      </w:r>
-      <w:r>
-        <w:t xml:space="preserve">0% identity and </w:t>
-      </w:r>
-      <w:r>
-        <w:t>7</w:t>
-      </w:r>
-      <w:r>
-        <w:t>0% query coverage</w:t>
-      </w:r>
-      <w:r>
-        <w:t xml:space="preserve">. </w:t>
+        <w:t xml:space="preserve"> command to count how many of the remaining hits are above &gt;70% identity and 70% query coverage. </w:t>
       </w:r>
       <w:r>
         <w:t xml:space="preserve">These may either real duplication events, or independent inserts of the same </w:t>

</xml_diff>

<commit_message>
Updated with new species
</commit_message>
<xml_diff>
--- a/HGT_pipeline.docx
+++ b/HGT_pipeline.docx
@@ -1,6 +1,6 @@
 
 <file path=word/document.xml><?xml version="1.0" encoding="utf-8"?>
-<w:document xmlns:wpc="http://schemas.microsoft.com/office/word/2010/wordprocessingCanvas" xmlns:cx="http://schemas.microsoft.com/office/drawing/2014/chartex" xmlns:cx1="http://schemas.microsoft.com/office/drawing/2015/9/8/chartex" xmlns:cx2="http://schemas.microsoft.com/office/drawing/2015/10/21/chartex" xmlns:cx3="http://schemas.microsoft.com/office/drawing/2016/5/9/chartex" xmlns:cx4="http://schemas.microsoft.com/office/drawing/2016/5/10/chartex" xmlns:cx5="http://schemas.microsoft.com/office/drawing/2016/5/11/chartex" xmlns:cx6="http://schemas.microsoft.com/office/drawing/2016/5/12/chartex" xmlns:cx7="http://schemas.microsoft.com/office/drawing/2016/5/13/chartex" xmlns:cx8="http://schemas.microsoft.com/office/drawing/2016/5/14/chartex" xmlns:mc="http://schemas.openxmlformats.org/markup-compatibility/2006" xmlns:aink="http://schemas.microsoft.com/office/drawing/2016/ink" xmlns:am3d="http://schemas.microsoft.com/office/drawing/2017/model3d" xmlns:o="urn:schemas-microsoft-com:office:office" xmlns:oel="http://schemas.microsoft.com/office/2019/extlst" xmlns:r="http://schemas.openxmlformats.org/officeDocument/2006/relationships" xmlns:m="http://schemas.openxmlformats.org/officeDocument/2006/math" xmlns:v="urn:schemas-microsoft-com:vml" xmlns:wp14="http://schemas.microsoft.com/office/word/2010/wordprocessingDrawing" xmlns:wp="http://schemas.openxmlformats.org/drawingml/2006/wordprocessingDrawing" xmlns:w10="urn:schemas-microsoft-com:office:word" xmlns:w="http://schemas.openxmlformats.org/wordprocessingml/2006/main" xmlns:w14="http://schemas.microsoft.com/office/word/2010/wordml" xmlns:w15="http://schemas.microsoft.com/office/word/2012/wordml" xmlns:w16cex="http://schemas.microsoft.com/office/word/2018/wordml/cex" xmlns:w16cid="http://schemas.microsoft.com/office/word/2016/wordml/cid" xmlns:w16="http://schemas.microsoft.com/office/word/2018/wordml" xmlns:w16sdtdh="http://schemas.microsoft.com/office/word/2020/wordml/sdtdatahash" xmlns:w16se="http://schemas.microsoft.com/office/word/2015/wordml/symex" xmlns:wpg="http://schemas.microsoft.com/office/word/2010/wordprocessingGroup" xmlns:wpi="http://schemas.microsoft.com/office/word/2010/wordprocessingInk" xmlns:wne="http://schemas.microsoft.com/office/word/2006/wordml" xmlns:wps="http://schemas.microsoft.com/office/word/2010/wordprocessingShape" mc:Ignorable="w14 w15 w16se w16cid w16 w16cex w16sdtdh wp14">
+<w:document xmlns:wpc="http://schemas.microsoft.com/office/word/2010/wordprocessingCanvas" xmlns:cx="http://schemas.microsoft.com/office/drawing/2014/chartex" xmlns:cx1="http://schemas.microsoft.com/office/drawing/2015/9/8/chartex" xmlns:cx2="http://schemas.microsoft.com/office/drawing/2015/10/21/chartex" xmlns:cx3="http://schemas.microsoft.com/office/drawing/2016/5/9/chartex" xmlns:cx4="http://schemas.microsoft.com/office/drawing/2016/5/10/chartex" xmlns:cx5="http://schemas.microsoft.com/office/drawing/2016/5/11/chartex" xmlns:cx6="http://schemas.microsoft.com/office/drawing/2016/5/12/chartex" xmlns:cx7="http://schemas.microsoft.com/office/drawing/2016/5/13/chartex" xmlns:cx8="http://schemas.microsoft.com/office/drawing/2016/5/14/chartex" xmlns:mc="http://schemas.openxmlformats.org/markup-compatibility/2006" xmlns:aink="http://schemas.microsoft.com/office/drawing/2016/ink" xmlns:am3d="http://schemas.microsoft.com/office/drawing/2017/model3d" xmlns:o="urn:schemas-microsoft-com:office:office" xmlns:r="http://schemas.openxmlformats.org/officeDocument/2006/relationships" xmlns:m="http://schemas.openxmlformats.org/officeDocument/2006/math" xmlns:v="urn:schemas-microsoft-com:vml" xmlns:wp14="http://schemas.microsoft.com/office/word/2010/wordprocessingDrawing" xmlns:wp="http://schemas.openxmlformats.org/drawingml/2006/wordprocessingDrawing" xmlns:w10="urn:schemas-microsoft-com:office:word" xmlns:w="http://schemas.openxmlformats.org/wordprocessingml/2006/main" xmlns:w14="http://schemas.microsoft.com/office/word/2010/wordml" xmlns:w15="http://schemas.microsoft.com/office/word/2012/wordml" xmlns:w16cid="http://schemas.microsoft.com/office/word/2016/wordml/cid" xmlns:w16se="http://schemas.microsoft.com/office/word/2015/wordml/symex" xmlns:wpg="http://schemas.microsoft.com/office/word/2010/wordprocessingGroup" xmlns:wpi="http://schemas.microsoft.com/office/word/2010/wordprocessingInk" xmlns:wne="http://schemas.microsoft.com/office/word/2006/wordml" xmlns:wps="http://schemas.microsoft.com/office/word/2010/wordprocessingShape" mc:Ignorable="w14 w15 w16se w16cid wp14">
   <w:body>
     <w:p>
       <w:pPr>
@@ -727,7 +727,23 @@
           <w:i/>
           <w:iCs/>
         </w:rPr>
-        <w:t xml:space="preserve"> gigantea </w:t>
+        <w:t xml:space="preserve"> </w:t>
+      </w:r>
+      <w:proofErr w:type="spellStart"/>
+      <w:r>
+        <w:rPr>
+          <w:i/>
+          <w:iCs/>
+        </w:rPr>
+        <w:t>gigantea</w:t>
+      </w:r>
+      <w:proofErr w:type="spellEnd"/>
+      <w:r>
+        <w:rPr>
+          <w:i/>
+          <w:iCs/>
+        </w:rPr>
+        <w:t xml:space="preserve"> </w:t>
       </w:r>
       <w:r>
         <w:sym w:font="Wingdings" w:char="F0E0"/>
@@ -1076,6 +1092,68 @@
           <w:numId w:val="1"/>
         </w:numPr>
       </w:pPr>
+      <w:bookmarkStart w:id="0" w:name="_GoBack"/>
+      <w:proofErr w:type="spellStart"/>
+      <w:r>
+        <w:rPr>
+          <w:i/>
+        </w:rPr>
+        <w:t>Diploptera</w:t>
+      </w:r>
+      <w:proofErr w:type="spellEnd"/>
+      <w:r>
+        <w:rPr>
+          <w:i/>
+        </w:rPr>
+        <w:t xml:space="preserve"> </w:t>
+      </w:r>
+      <w:proofErr w:type="spellStart"/>
+      <w:r>
+        <w:rPr>
+          <w:i/>
+        </w:rPr>
+        <w:t>punctata</w:t>
+      </w:r>
+      <w:proofErr w:type="spellEnd"/>
+      <w:r>
+        <w:t xml:space="preserve"> </w:t>
+      </w:r>
+      <w:bookmarkEnd w:id="0"/>
+      <w:r>
+        <w:sym w:font="Wingdings" w:char="F0E0"/>
+      </w:r>
+      <w:r>
+        <w:t xml:space="preserve"> </w:t>
+      </w:r>
+      <w:r>
+        <w:t>GCA_030220185.1</w:t>
+      </w:r>
+    </w:p>
+    <w:p>
+      <w:pPr>
+        <w:pStyle w:val="ListParagraph"/>
+        <w:numPr>
+          <w:ilvl w:val="1"/>
+          <w:numId w:val="1"/>
+        </w:numPr>
+      </w:pPr>
+      <w:r>
+        <w:t xml:space="preserve">from </w:t>
+      </w:r>
+      <w:proofErr w:type="spellStart"/>
+      <w:r>
+        <w:t>Genbank</w:t>
+      </w:r>
+      <w:proofErr w:type="spellEnd"/>
+    </w:p>
+    <w:p>
+      <w:pPr>
+        <w:pStyle w:val="ListParagraph"/>
+        <w:numPr>
+          <w:ilvl w:val="0"/>
+          <w:numId w:val="1"/>
+        </w:numPr>
+      </w:pPr>
       <w:proofErr w:type="spellStart"/>
       <w:r>
         <w:rPr>
@@ -1090,7 +1168,23 @@
           <w:i/>
           <w:iCs/>
         </w:rPr>
-        <w:t xml:space="preserve"> americana </w:t>
+        <w:t xml:space="preserve"> </w:t>
+      </w:r>
+      <w:proofErr w:type="spellStart"/>
+      <w:r>
+        <w:rPr>
+          <w:i/>
+          <w:iCs/>
+        </w:rPr>
+        <w:t>americana</w:t>
+      </w:r>
+      <w:proofErr w:type="spellEnd"/>
+      <w:r>
+        <w:rPr>
+          <w:i/>
+          <w:iCs/>
+        </w:rPr>
+        <w:t xml:space="preserve"> </w:t>
       </w:r>
       <w:r>
         <w:t>v1</w:t>
@@ -1148,8 +1242,17 @@
           <w:i/>
           <w:iCs/>
         </w:rPr>
-        <w:t xml:space="preserve"> americana</w:t>
-      </w:r>
+        <w:t xml:space="preserve"> </w:t>
+      </w:r>
+      <w:proofErr w:type="spellStart"/>
+      <w:r>
+        <w:rPr>
+          <w:i/>
+          <w:iCs/>
+        </w:rPr>
+        <w:t>americana</w:t>
+      </w:r>
+      <w:proofErr w:type="spellEnd"/>
       <w:r>
         <w:t xml:space="preserve"> v2</w:t>
       </w:r>
@@ -1238,8 +1341,17 @@
           <w:i/>
           <w:iCs/>
         </w:rPr>
-        <w:t xml:space="preserve"> americana</w:t>
-      </w:r>
+        <w:t xml:space="preserve"> </w:t>
+      </w:r>
+      <w:proofErr w:type="spellStart"/>
+      <w:r>
+        <w:rPr>
+          <w:i/>
+          <w:iCs/>
+        </w:rPr>
+        <w:t>americana</w:t>
+      </w:r>
+      <w:proofErr w:type="spellEnd"/>
       <w:r>
         <w:t xml:space="preserve"> v3 </w:t>
       </w:r>
@@ -1284,8 +1396,17 @@
           <w:i/>
           <w:iCs/>
         </w:rPr>
-        <w:t xml:space="preserve"> americana</w:t>
-      </w:r>
+        <w:t xml:space="preserve"> </w:t>
+      </w:r>
+      <w:proofErr w:type="spellStart"/>
+      <w:r>
+        <w:rPr>
+          <w:i/>
+          <w:iCs/>
+        </w:rPr>
+        <w:t>americana</w:t>
+      </w:r>
+      <w:proofErr w:type="spellEnd"/>
       <w:r>
         <w:t xml:space="preserve"> v</w:t>
       </w:r>
@@ -1342,13 +1463,32 @@
           <w:numId w:val="1"/>
         </w:numPr>
       </w:pPr>
-      <w:r>
-        <w:rPr>
-          <w:i/>
-          <w:iCs/>
-        </w:rPr>
-        <w:t>Blattella germanica</w:t>
-      </w:r>
+      <w:proofErr w:type="spellStart"/>
+      <w:r>
+        <w:rPr>
+          <w:i/>
+          <w:iCs/>
+        </w:rPr>
+        <w:lastRenderedPageBreak/>
+        <w:t>Blattella</w:t>
+      </w:r>
+      <w:proofErr w:type="spellEnd"/>
+      <w:r>
+        <w:rPr>
+          <w:i/>
+          <w:iCs/>
+        </w:rPr>
+        <w:t xml:space="preserve"> </w:t>
+      </w:r>
+      <w:proofErr w:type="spellStart"/>
+      <w:r>
+        <w:rPr>
+          <w:i/>
+          <w:iCs/>
+        </w:rPr>
+        <w:t>germanica</w:t>
+      </w:r>
+      <w:proofErr w:type="spellEnd"/>
       <w:r>
         <w:rPr>
           <w:i/>
@@ -1431,7 +1571,6 @@
           <w:i/>
           <w:iCs/>
         </w:rPr>
-        <w:lastRenderedPageBreak/>
         <w:t xml:space="preserve">Blattella germanica </w:t>
       </w:r>
       <w:r>
@@ -1833,9 +1972,11 @@
           <w:numId w:val="1"/>
         </w:numPr>
       </w:pPr>
+      <w:proofErr w:type="spellStart"/>
       <w:r>
         <w:t>Reticulitermes</w:t>
       </w:r>
+      <w:proofErr w:type="spellEnd"/>
       <w:r>
         <w:t xml:space="preserve"> </w:t>
       </w:r>
@@ -1925,6 +2066,7 @@
         </w:rPr>
         <w:t xml:space="preserve"> </w:t>
       </w:r>
+      <w:proofErr w:type="spellStart"/>
       <w:r>
         <w:rPr>
           <w:i/>
@@ -1932,6 +2074,7 @@
         </w:rPr>
         <w:t>sinensis</w:t>
       </w:r>
+      <w:proofErr w:type="spellEnd"/>
       <w:r>
         <w:rPr>
           <w:i/>
@@ -2268,16 +2411,7 @@
           <w:i/>
           <w:iCs/>
         </w:rPr>
-        <w:t xml:space="preserve"> and Oscar are working on thi</w:t>
-      </w:r>
-      <w:r>
-        <w:rPr>
-          <w:b/>
-          <w:bCs/>
-          <w:i/>
-          <w:iCs/>
-        </w:rPr>
-        <w:t>s.</w:t>
+        <w:t xml:space="preserve"> and Oscar are working on this.</w:t>
       </w:r>
     </w:p>
     <w:p/>
@@ -2726,6 +2860,7 @@
     </w:p>
     <w:p>
       <w:r>
+        <w:lastRenderedPageBreak/>
         <w:t>The genome annotation (when available) was used to annotate the chunks as intergenic or within a gene (and what feature of the gene).</w:t>
       </w:r>
     </w:p>
@@ -3322,143 +3457,143 @@
         <w:rPr>
           <w:iCs/>
         </w:rPr>
+        <w:t>“</w:t>
+      </w:r>
+      <w:proofErr w:type="spellStart"/>
+      <w:r>
+        <w:rPr>
+          <w:iCs/>
+        </w:rPr>
+        <w:t>Blatta</w:t>
+      </w:r>
+      <w:r>
+        <w:rPr>
+          <w:iCs/>
+        </w:rPr>
+        <w:t>bacterium</w:t>
+      </w:r>
+      <w:proofErr w:type="spellEnd"/>
+      <w:r>
+        <w:rPr>
+          <w:iCs/>
+        </w:rPr>
+        <w:t xml:space="preserve"> </w:t>
+      </w:r>
+      <w:r>
+        <w:rPr>
+          <w:iCs/>
+        </w:rPr>
+        <w:t>BLAST</w:t>
+      </w:r>
+      <w:r>
+        <w:rPr>
+          <w:iCs/>
+        </w:rPr>
+        <w:t xml:space="preserve"> </w:t>
+      </w:r>
+      <w:r>
+        <w:rPr>
+          <w:iCs/>
+        </w:rPr>
+        <w:t>%</w:t>
+      </w:r>
+      <w:r>
+        <w:rPr>
+          <w:iCs/>
+        </w:rPr>
+        <w:t xml:space="preserve"> </w:t>
+      </w:r>
+      <w:r>
+        <w:rPr>
+          <w:iCs/>
+        </w:rPr>
+        <w:t>identity</w:t>
+      </w:r>
+      <w:r>
+        <w:rPr>
+          <w:iCs/>
+        </w:rPr>
+        <w:t>” - “</w:t>
+      </w:r>
+      <w:r>
+        <w:rPr>
+          <w:iCs/>
+        </w:rPr>
+        <w:t>insert</w:t>
+      </w:r>
+      <w:r>
+        <w:rPr>
+          <w:iCs/>
+        </w:rPr>
+        <w:t xml:space="preserve"> </w:t>
+      </w:r>
+      <w:r>
+        <w:rPr>
+          <w:iCs/>
+        </w:rPr>
+        <w:t>d</w:t>
+      </w:r>
+      <w:r>
+        <w:rPr>
+          <w:iCs/>
+        </w:rPr>
+        <w:t xml:space="preserve">atabase </w:t>
+      </w:r>
+      <w:r>
+        <w:rPr>
+          <w:iCs/>
+        </w:rPr>
+        <w:t>BLAST</w:t>
+      </w:r>
+      <w:r>
+        <w:rPr>
+          <w:iCs/>
+        </w:rPr>
+        <w:t xml:space="preserve"> </w:t>
+      </w:r>
+      <w:r>
+        <w:rPr>
+          <w:iCs/>
+        </w:rPr>
+        <w:t>%</w:t>
+      </w:r>
+      <w:r>
+        <w:rPr>
+          <w:iCs/>
+        </w:rPr>
+        <w:t xml:space="preserve"> </w:t>
+      </w:r>
+      <w:r>
+        <w:rPr>
+          <w:iCs/>
+        </w:rPr>
+        <w:t>identity</w:t>
+      </w:r>
+      <w:r>
+        <w:rPr>
+          <w:iCs/>
+        </w:rPr>
+        <w:t>”</w:t>
+      </w:r>
+    </w:p>
+    <w:p>
+      <w:pPr>
+        <w:rPr>
+          <w:iCs/>
+        </w:rPr>
+      </w:pPr>
+    </w:p>
+    <w:p>
+      <w:pPr>
+        <w:rPr>
+          <w:iCs/>
+        </w:rPr>
+      </w:pPr>
+      <w:r>
+        <w:rPr>
+          <w:iCs/>
+        </w:rPr>
         <w:lastRenderedPageBreak/>
-        <w:t>“</w:t>
-      </w:r>
-      <w:proofErr w:type="spellStart"/>
-      <w:r>
-        <w:rPr>
-          <w:iCs/>
-        </w:rPr>
-        <w:t>Blatta</w:t>
-      </w:r>
-      <w:r>
-        <w:rPr>
-          <w:iCs/>
-        </w:rPr>
-        <w:t>bacterium</w:t>
-      </w:r>
-      <w:proofErr w:type="spellEnd"/>
-      <w:r>
-        <w:rPr>
-          <w:iCs/>
-        </w:rPr>
-        <w:t xml:space="preserve"> </w:t>
-      </w:r>
-      <w:r>
-        <w:rPr>
-          <w:iCs/>
-        </w:rPr>
-        <w:t>BLAST</w:t>
-      </w:r>
-      <w:r>
-        <w:rPr>
-          <w:iCs/>
-        </w:rPr>
-        <w:t xml:space="preserve"> </w:t>
-      </w:r>
-      <w:r>
-        <w:rPr>
-          <w:iCs/>
-        </w:rPr>
-        <w:t>%</w:t>
-      </w:r>
-      <w:r>
-        <w:rPr>
-          <w:iCs/>
-        </w:rPr>
-        <w:t xml:space="preserve"> </w:t>
-      </w:r>
-      <w:r>
-        <w:rPr>
-          <w:iCs/>
-        </w:rPr>
-        <w:t>identity</w:t>
-      </w:r>
-      <w:r>
-        <w:rPr>
-          <w:iCs/>
-        </w:rPr>
-        <w:t>” - “</w:t>
-      </w:r>
-      <w:r>
-        <w:rPr>
-          <w:iCs/>
-        </w:rPr>
-        <w:t>insert</w:t>
-      </w:r>
-      <w:r>
-        <w:rPr>
-          <w:iCs/>
-        </w:rPr>
-        <w:t xml:space="preserve"> </w:t>
-      </w:r>
-      <w:r>
-        <w:rPr>
-          <w:iCs/>
-        </w:rPr>
-        <w:t>d</w:t>
-      </w:r>
-      <w:r>
-        <w:rPr>
-          <w:iCs/>
-        </w:rPr>
-        <w:t xml:space="preserve">atabase </w:t>
-      </w:r>
-      <w:r>
-        <w:rPr>
-          <w:iCs/>
-        </w:rPr>
-        <w:t>BLAST</w:t>
-      </w:r>
-      <w:r>
-        <w:rPr>
-          <w:iCs/>
-        </w:rPr>
-        <w:t xml:space="preserve"> </w:t>
-      </w:r>
-      <w:r>
-        <w:rPr>
-          <w:iCs/>
-        </w:rPr>
-        <w:t>%</w:t>
-      </w:r>
-      <w:r>
-        <w:rPr>
-          <w:iCs/>
-        </w:rPr>
-        <w:t xml:space="preserve"> </w:t>
-      </w:r>
-      <w:r>
-        <w:rPr>
-          <w:iCs/>
-        </w:rPr>
-        <w:t>identity</w:t>
-      </w:r>
-      <w:r>
-        <w:rPr>
-          <w:iCs/>
-        </w:rPr>
-        <w:t>”</w:t>
-      </w:r>
-    </w:p>
-    <w:p>
-      <w:pPr>
-        <w:rPr>
-          <w:iCs/>
-        </w:rPr>
-      </w:pPr>
-    </w:p>
-    <w:p>
-      <w:pPr>
-        <w:rPr>
-          <w:iCs/>
-        </w:rPr>
-      </w:pPr>
-      <w:r>
-        <w:rPr>
-          <w:iCs/>
-        </w:rPr>
         <w:t xml:space="preserve">A negative value (i.e. low </w:t>
       </w:r>
       <w:proofErr w:type="spellStart"/>
@@ -3968,6 +4103,7 @@
           <w:bCs/>
           <w:iCs/>
         </w:rPr>
+        <w:lastRenderedPageBreak/>
         <w:t xml:space="preserve">Creating a pipeline to count the number of long reads that clearly span the insert with lots of flanking region (i.e. the insert sits within a raw read). This is equivalent to checking the alignments and observing that some truncated reads are clearly of </w:t>
       </w:r>
       <w:proofErr w:type="spellStart"/>
@@ -4007,7 +4143,7 @@
 </file>
 
 <file path=word/numbering.xml><?xml version="1.0" encoding="utf-8"?>
-<w:numbering xmlns:wpc="http://schemas.microsoft.com/office/word/2010/wordprocessingCanvas" xmlns:cx="http://schemas.microsoft.com/office/drawing/2014/chartex" xmlns:cx1="http://schemas.microsoft.com/office/drawing/2015/9/8/chartex" xmlns:cx2="http://schemas.microsoft.com/office/drawing/2015/10/21/chartex" xmlns:cx3="http://schemas.microsoft.com/office/drawing/2016/5/9/chartex" xmlns:cx4="http://schemas.microsoft.com/office/drawing/2016/5/10/chartex" xmlns:cx5="http://schemas.microsoft.com/office/drawing/2016/5/11/chartex" xmlns:cx6="http://schemas.microsoft.com/office/drawing/2016/5/12/chartex" xmlns:cx7="http://schemas.microsoft.com/office/drawing/2016/5/13/chartex" xmlns:cx8="http://schemas.microsoft.com/office/drawing/2016/5/14/chartex" xmlns:mc="http://schemas.openxmlformats.org/markup-compatibility/2006" xmlns:aink="http://schemas.microsoft.com/office/drawing/2016/ink" xmlns:am3d="http://schemas.microsoft.com/office/drawing/2017/model3d" xmlns:o="urn:schemas-microsoft-com:office:office" xmlns:oel="http://schemas.microsoft.com/office/2019/extlst" xmlns:r="http://schemas.openxmlformats.org/officeDocument/2006/relationships" xmlns:m="http://schemas.openxmlformats.org/officeDocument/2006/math" xmlns:v="urn:schemas-microsoft-com:vml" xmlns:wp14="http://schemas.microsoft.com/office/word/2010/wordprocessingDrawing" xmlns:wp="http://schemas.openxmlformats.org/drawingml/2006/wordprocessingDrawing" xmlns:w10="urn:schemas-microsoft-com:office:word" xmlns:w="http://schemas.openxmlformats.org/wordprocessingml/2006/main" xmlns:w14="http://schemas.microsoft.com/office/word/2010/wordml" xmlns:w15="http://schemas.microsoft.com/office/word/2012/wordml" xmlns:w16cex="http://schemas.microsoft.com/office/word/2018/wordml/cex" xmlns:w16cid="http://schemas.microsoft.com/office/word/2016/wordml/cid" xmlns:w16="http://schemas.microsoft.com/office/word/2018/wordml" xmlns:w16sdtdh="http://schemas.microsoft.com/office/word/2020/wordml/sdtdatahash" xmlns:w16se="http://schemas.microsoft.com/office/word/2015/wordml/symex" xmlns:wpg="http://schemas.microsoft.com/office/word/2010/wordprocessingGroup" xmlns:wpi="http://schemas.microsoft.com/office/word/2010/wordprocessingInk" xmlns:wne="http://schemas.microsoft.com/office/word/2006/wordml" xmlns:wps="http://schemas.microsoft.com/office/word/2010/wordprocessingShape" mc:Ignorable="w14 w15 w16se w16cid w16 w16cex w16sdtdh wp14">
+<w:numbering xmlns:wpc="http://schemas.microsoft.com/office/word/2010/wordprocessingCanvas" xmlns:cx="http://schemas.microsoft.com/office/drawing/2014/chartex" xmlns:cx1="http://schemas.microsoft.com/office/drawing/2015/9/8/chartex" xmlns:cx2="http://schemas.microsoft.com/office/drawing/2015/10/21/chartex" xmlns:cx3="http://schemas.microsoft.com/office/drawing/2016/5/9/chartex" xmlns:cx4="http://schemas.microsoft.com/office/drawing/2016/5/10/chartex" xmlns:cx5="http://schemas.microsoft.com/office/drawing/2016/5/11/chartex" xmlns:cx6="http://schemas.microsoft.com/office/drawing/2016/5/12/chartex" xmlns:cx7="http://schemas.microsoft.com/office/drawing/2016/5/13/chartex" xmlns:cx8="http://schemas.microsoft.com/office/drawing/2016/5/14/chartex" xmlns:mc="http://schemas.openxmlformats.org/markup-compatibility/2006" xmlns:aink="http://schemas.microsoft.com/office/drawing/2016/ink" xmlns:am3d="http://schemas.microsoft.com/office/drawing/2017/model3d" xmlns:o="urn:schemas-microsoft-com:office:office" xmlns:r="http://schemas.openxmlformats.org/officeDocument/2006/relationships" xmlns:m="http://schemas.openxmlformats.org/officeDocument/2006/math" xmlns:v="urn:schemas-microsoft-com:vml" xmlns:wp14="http://schemas.microsoft.com/office/word/2010/wordprocessingDrawing" xmlns:wp="http://schemas.openxmlformats.org/drawingml/2006/wordprocessingDrawing" xmlns:w10="urn:schemas-microsoft-com:office:word" xmlns:w="http://schemas.openxmlformats.org/wordprocessingml/2006/main" xmlns:w14="http://schemas.microsoft.com/office/word/2010/wordml" xmlns:w15="http://schemas.microsoft.com/office/word/2012/wordml" xmlns:w16cid="http://schemas.microsoft.com/office/word/2016/wordml/cid" xmlns:w16se="http://schemas.microsoft.com/office/word/2015/wordml/symex" xmlns:wpg="http://schemas.microsoft.com/office/word/2010/wordprocessingGroup" xmlns:wpi="http://schemas.microsoft.com/office/word/2010/wordprocessingInk" xmlns:wne="http://schemas.microsoft.com/office/word/2006/wordml" xmlns:wps="http://schemas.microsoft.com/office/word/2010/wordprocessingShape" mc:Ignorable="w14 w15 w16se w16cid wp14">
   <w:abstractNum w:abstractNumId="0" w15:restartNumberingAfterBreak="0">
     <w:nsid w:val="7B891B41"/>
     <w:multiLevelType w:val="hybridMultilevel"/>
@@ -4121,14 +4257,14 @@
       </w:rPr>
     </w:lvl>
   </w:abstractNum>
-  <w:num w:numId="1" w16cid:durableId="189539201">
+  <w:num w:numId="1">
     <w:abstractNumId w:val="0"/>
   </w:num>
 </w:numbering>
 </file>
 
 <file path=word/styles.xml><?xml version="1.0" encoding="utf-8"?>
-<w:styles xmlns:mc="http://schemas.openxmlformats.org/markup-compatibility/2006" xmlns:r="http://schemas.openxmlformats.org/officeDocument/2006/relationships" xmlns:w="http://schemas.openxmlformats.org/wordprocessingml/2006/main" xmlns:w14="http://schemas.microsoft.com/office/word/2010/wordml" xmlns:w15="http://schemas.microsoft.com/office/word/2012/wordml" xmlns:w16cex="http://schemas.microsoft.com/office/word/2018/wordml/cex" xmlns:w16cid="http://schemas.microsoft.com/office/word/2016/wordml/cid" xmlns:w16="http://schemas.microsoft.com/office/word/2018/wordml" xmlns:w16sdtdh="http://schemas.microsoft.com/office/word/2020/wordml/sdtdatahash" xmlns:w16se="http://schemas.microsoft.com/office/word/2015/wordml/symex" mc:Ignorable="w14 w15 w16se w16cid w16 w16cex w16sdtdh">
+<w:styles xmlns:mc="http://schemas.openxmlformats.org/markup-compatibility/2006" xmlns:r="http://schemas.openxmlformats.org/officeDocument/2006/relationships" xmlns:w="http://schemas.openxmlformats.org/wordprocessingml/2006/main" xmlns:w14="http://schemas.microsoft.com/office/word/2010/wordml" xmlns:w15="http://schemas.microsoft.com/office/word/2012/wordml" xmlns:w16cid="http://schemas.microsoft.com/office/word/2016/wordml/cid" xmlns:w16se="http://schemas.microsoft.com/office/word/2015/wordml/symex" mc:Ignorable="w14 w15 w16se w16cid">
   <w:docDefaults>
     <w:rPrDefault>
       <w:rPr>
@@ -4142,7 +4278,7 @@
     </w:rPrDefault>
     <w:pPrDefault/>
   </w:docDefaults>
-  <w:latentStyles w:defLockedState="0" w:defUIPriority="99" w:defSemiHidden="0" w:defUnhideWhenUsed="0" w:defQFormat="0" w:count="376">
+  <w:latentStyles w:defLockedState="0" w:defUIPriority="99" w:defSemiHidden="0" w:defUnhideWhenUsed="0" w:defQFormat="0" w:count="375">
     <w:lsdException w:name="Normal" w:uiPriority="0" w:qFormat="1"/>
     <w:lsdException w:name="heading 1" w:uiPriority="9" w:qFormat="1"/>
     <w:lsdException w:name="heading 2" w:semiHidden="1" w:uiPriority="9" w:unhideWhenUsed="1" w:qFormat="1"/>
@@ -4518,7 +4654,6 @@
     <w:lsdException w:name="Smart Hyperlink" w:semiHidden="1" w:unhideWhenUsed="1"/>
     <w:lsdException w:name="Hashtag" w:semiHidden="1" w:unhideWhenUsed="1"/>
     <w:lsdException w:name="Unresolved Mention" w:semiHidden="1" w:unhideWhenUsed="1"/>
-    <w:lsdException w:name="Smart Link" w:semiHidden="1" w:unhideWhenUsed="1"/>
   </w:latentStyles>
   <w:style w:type="paragraph" w:default="1" w:styleId="Normal">
     <w:name w:val="Normal"/>

</xml_diff>